<commit_message>
Added questions for self-check. Marked module 9 as done
</commit_message>
<xml_diff>
--- a/07.Containerization/Hometask.docx
+++ b/07.Containerization/Hometask.docx
@@ -452,6 +452,21 @@
           <w:rFonts w:ascii="Verdana" w:hAnsi="Verdana"/>
         </w:rPr>
       </w:pPr>
+      <w:r>
+        <w:rPr>
+          <w:rFonts w:ascii="Verdana" w:hAnsi="Verdana"/>
+        </w:rPr>
+        <w:t>In containerization, orchestration is the automated management of containerized workloads — including deployment, scaling, networking, health monitoring, and scheduling across the cluster. Tools like Kubernetes and Docker Swarm ensure containers are running as desired, restart failed ones, and balance workloads.</w:t>
+      </w:r>
+    </w:p>
+    <w:p>
+      <w:pPr>
+        <w:spacing w:before="100" w:beforeAutospacing="1" w:line="240" w:lineRule="auto"/>
+        <w:jc w:val="both"/>
+        <w:rPr>
+          <w:rFonts w:ascii="Verdana" w:hAnsi="Verdana"/>
+        </w:rPr>
+      </w:pPr>
     </w:p>
     <w:p>
       <w:pPr>
@@ -482,6 +497,287 @@
           <w:rFonts w:ascii="Verdana" w:hAnsi="Verdana"/>
         </w:rPr>
       </w:pPr>
+      <w:r>
+        <w:rPr>
+          <w:rFonts w:ascii="Verdana" w:hAnsi="Verdana"/>
+        </w:rPr>
+        <w:t>Containers are lightweight software packages that contain all the dependencies required to execute the contained software application. These dependencies include things like system libraries, external third-party code packages, and other operating system level applications. The dependencies included in a container exist in stack levels that are higher than the operating system.</w:t>
+      </w:r>
+    </w:p>
+    <w:p>
+      <w:pPr>
+        <w:spacing w:before="100" w:beforeAutospacing="1" w:line="240" w:lineRule="auto"/>
+        <w:jc w:val="both"/>
+        <w:rPr>
+          <w:rFonts w:ascii="Verdana" w:hAnsi="Verdana"/>
+          <w:u w:val="single"/>
+        </w:rPr>
+      </w:pPr>
+      <w:r>
+        <w:rPr>
+          <w:rFonts w:ascii="Verdana" w:hAnsi="Verdana"/>
+          <w:u w:val="single"/>
+        </w:rPr>
+        <w:t>Pros</w:t>
+      </w:r>
+      <w:r>
+        <w:rPr>
+          <w:rFonts w:ascii="Verdana" w:hAnsi="Verdana"/>
+          <w:u w:val="single"/>
+        </w:rPr>
+        <w:t>:</w:t>
+      </w:r>
+    </w:p>
+    <w:p>
+      <w:pPr>
+        <w:pStyle w:val="ListParagraph"/>
+        <w:numPr>
+          <w:ilvl w:val="0"/>
+          <w:numId w:val="44"/>
+        </w:numPr>
+        <w:spacing w:before="100" w:beforeAutospacing="1" w:line="240" w:lineRule="auto"/>
+        <w:jc w:val="both"/>
+        <w:rPr>
+          <w:rFonts w:ascii="Verdana" w:hAnsi="Verdana"/>
+        </w:rPr>
+      </w:pPr>
+      <w:r>
+        <w:rPr>
+          <w:rFonts w:ascii="Verdana" w:hAnsi="Verdana"/>
+          <w:b/>
+          <w:bCs/>
+        </w:rPr>
+        <w:t>Iteration speed:</w:t>
+      </w:r>
+      <w:r>
+        <w:rPr>
+          <w:rFonts w:ascii="Verdana" w:hAnsi="Verdana"/>
+        </w:rPr>
+        <w:t xml:space="preserve"> Because containers are lightweight and only include high level software, they are very fast to modify and iterate on.</w:t>
+      </w:r>
+    </w:p>
+    <w:p>
+      <w:pPr>
+        <w:pStyle w:val="ListParagraph"/>
+        <w:numPr>
+          <w:ilvl w:val="0"/>
+          <w:numId w:val="44"/>
+        </w:numPr>
+        <w:spacing w:before="100" w:beforeAutospacing="1" w:line="240" w:lineRule="auto"/>
+        <w:jc w:val="both"/>
+        <w:rPr>
+          <w:rFonts w:ascii="Verdana" w:hAnsi="Verdana"/>
+        </w:rPr>
+      </w:pPr>
+      <w:r>
+        <w:rPr>
+          <w:rFonts w:ascii="Verdana" w:hAnsi="Verdana"/>
+          <w:b/>
+          <w:bCs/>
+        </w:rPr>
+        <w:t>Robust ecosystem:</w:t>
+      </w:r>
+      <w:r>
+        <w:rPr>
+          <w:rFonts w:ascii="Verdana" w:hAnsi="Verdana"/>
+        </w:rPr>
+        <w:t xml:space="preserve"> Most container runtime systems offer a hosted public repository of pre-made containers. These container repositories contain many popular software applications like databases or messaging systems and can be instantly downloaded and executed, saving time for development teams</w:t>
+      </w:r>
+      <w:r>
+        <w:rPr>
+          <w:rFonts w:ascii="Verdana" w:hAnsi="Verdana"/>
+        </w:rPr>
+        <w:t>.</w:t>
+      </w:r>
+    </w:p>
+    <w:p>
+      <w:pPr>
+        <w:pStyle w:val="ListParagraph"/>
+        <w:numPr>
+          <w:ilvl w:val="0"/>
+          <w:numId w:val="44"/>
+        </w:numPr>
+        <w:spacing w:before="100" w:beforeAutospacing="1" w:line="240" w:lineRule="auto"/>
+        <w:jc w:val="both"/>
+        <w:rPr>
+          <w:rFonts w:ascii="Verdana" w:hAnsi="Verdana"/>
+        </w:rPr>
+      </w:pPr>
+      <w:r>
+        <w:rPr>
+          <w:rFonts w:ascii="Verdana" w:hAnsi="Verdana"/>
+          <w:b/>
+          <w:bCs/>
+        </w:rPr>
+        <w:t>Isolation</w:t>
+      </w:r>
+      <w:r>
+        <w:rPr>
+          <w:rFonts w:ascii="Verdana" w:hAnsi="Verdana"/>
+          <w:b/>
+          <w:bCs/>
+        </w:rPr>
+        <w:t>:</w:t>
+      </w:r>
+      <w:r>
+        <w:rPr>
+          <w:rFonts w:ascii="Verdana" w:hAnsi="Verdana"/>
+        </w:rPr>
+        <w:t xml:space="preserve"> Containers allow developers to isolate microservice inside a software-defined environment. In turn, containers make it easier to set limits on each microservice's resource consumption and prevent potential noisy neighbor issues.</w:t>
+      </w:r>
+    </w:p>
+    <w:p>
+      <w:pPr>
+        <w:pStyle w:val="ListParagraph"/>
+        <w:numPr>
+          <w:ilvl w:val="0"/>
+          <w:numId w:val="44"/>
+        </w:numPr>
+        <w:spacing w:before="100" w:beforeAutospacing="1" w:line="240" w:lineRule="auto"/>
+        <w:jc w:val="both"/>
+        <w:rPr>
+          <w:rFonts w:ascii="Verdana" w:hAnsi="Verdana"/>
+        </w:rPr>
+      </w:pPr>
+      <w:r>
+        <w:rPr>
+          <w:rFonts w:ascii="Verdana" w:hAnsi="Verdana"/>
+          <w:b/>
+          <w:bCs/>
+        </w:rPr>
+        <w:t>Efficiency</w:t>
+      </w:r>
+      <w:r>
+        <w:rPr>
+          <w:rFonts w:ascii="Verdana" w:hAnsi="Verdana"/>
+          <w:b/>
+          <w:bCs/>
+        </w:rPr>
+        <w:t>:</w:t>
+      </w:r>
+      <w:r>
+        <w:rPr>
+          <w:rFonts w:ascii="Verdana" w:hAnsi="Verdana"/>
+        </w:rPr>
+        <w:t xml:space="preserve"> Because of a lower resource overhead, large collections of microservices tend to run more efficiently with containers than traditional VMs or a single direct host.</w:t>
+      </w:r>
+    </w:p>
+    <w:p>
+      <w:pPr>
+        <w:pStyle w:val="ListParagraph"/>
+        <w:numPr>
+          <w:ilvl w:val="0"/>
+          <w:numId w:val="44"/>
+        </w:numPr>
+        <w:spacing w:before="100" w:beforeAutospacing="1" w:line="240" w:lineRule="auto"/>
+        <w:jc w:val="both"/>
+        <w:rPr>
+          <w:rFonts w:ascii="Verdana" w:hAnsi="Verdana"/>
+        </w:rPr>
+      </w:pPr>
+      <w:r>
+        <w:rPr>
+          <w:rFonts w:ascii="Verdana" w:hAnsi="Verdana"/>
+          <w:b/>
+          <w:bCs/>
+        </w:rPr>
+        <w:t>Parity</w:t>
+      </w:r>
+      <w:r>
+        <w:rPr>
+          <w:rFonts w:ascii="Verdana" w:hAnsi="Verdana"/>
+          <w:b/>
+          <w:bCs/>
+        </w:rPr>
+        <w:t>:</w:t>
+      </w:r>
+      <w:r>
+        <w:rPr>
+          <w:rFonts w:ascii="Verdana" w:hAnsi="Verdana"/>
+        </w:rPr>
+        <w:t xml:space="preserve"> For the most part, a microservice hosted inside a container will operate in a consistent manner, regardless of the underlying host environment configurations. This reduces the number of variables developers need to contend with during the testing and deployment stages.</w:t>
+      </w:r>
+    </w:p>
+    <w:p>
+      <w:pPr>
+        <w:pStyle w:val="ListParagraph"/>
+        <w:numPr>
+          <w:ilvl w:val="0"/>
+          <w:numId w:val="44"/>
+        </w:numPr>
+        <w:spacing w:before="100" w:beforeAutospacing="1" w:line="240" w:lineRule="auto"/>
+        <w:jc w:val="both"/>
+        <w:rPr>
+          <w:rFonts w:ascii="Verdana" w:hAnsi="Verdana"/>
+        </w:rPr>
+      </w:pPr>
+      <w:r>
+        <w:rPr>
+          <w:rFonts w:ascii="Verdana" w:hAnsi="Verdana"/>
+          <w:b/>
+          <w:bCs/>
+        </w:rPr>
+        <w:lastRenderedPageBreak/>
+        <w:t>Scaling</w:t>
+      </w:r>
+      <w:r>
+        <w:rPr>
+          <w:rFonts w:ascii="Verdana" w:hAnsi="Verdana"/>
+          <w:b/>
+          <w:bCs/>
+        </w:rPr>
+        <w:t>:</w:t>
+      </w:r>
+      <w:r>
+        <w:rPr>
+          <w:rFonts w:ascii="Verdana" w:hAnsi="Verdana"/>
+        </w:rPr>
+        <w:t xml:space="preserve"> It's possible to scale containerized microservices simply by adding more container instances, mitigating the complexity of scaling microservices in response to dynamic shifts in application demand.</w:t>
+      </w:r>
+    </w:p>
+    <w:p>
+      <w:pPr>
+        <w:spacing w:before="100" w:beforeAutospacing="1" w:line="240" w:lineRule="auto"/>
+        <w:jc w:val="both"/>
+        <w:rPr>
+          <w:rFonts w:ascii="Verdana" w:hAnsi="Verdana"/>
+          <w:u w:val="single"/>
+        </w:rPr>
+      </w:pPr>
+      <w:r>
+        <w:rPr>
+          <w:rFonts w:ascii="Verdana" w:hAnsi="Verdana"/>
+          <w:u w:val="single"/>
+        </w:rPr>
+        <w:t>Cons</w:t>
+      </w:r>
+      <w:r>
+        <w:rPr>
+          <w:rFonts w:ascii="Verdana" w:hAnsi="Verdana"/>
+          <w:u w:val="single"/>
+        </w:rPr>
+        <w:t>:</w:t>
+      </w:r>
+    </w:p>
+    <w:p>
+      <w:pPr>
+        <w:pStyle w:val="ListParagraph"/>
+        <w:numPr>
+          <w:ilvl w:val="0"/>
+          <w:numId w:val="47"/>
+        </w:numPr>
+        <w:spacing w:before="100" w:beforeAutospacing="1" w:line="240" w:lineRule="auto"/>
+        <w:jc w:val="both"/>
+        <w:rPr>
+          <w:rFonts w:ascii="Verdana" w:hAnsi="Verdana"/>
+        </w:rPr>
+      </w:pPr>
+      <w:r>
+        <w:rPr>
+          <w:rFonts w:ascii="Verdana" w:hAnsi="Verdana"/>
+        </w:rPr>
+        <w:t>Security risks from shared host vulnerabilities and unverified public images; added operational complexity (learning curve, tooling); may be overkill for small/simple workloads.</w:t>
+      </w:r>
     </w:p>
     <w:p>
       <w:pPr>
@@ -512,6 +808,119 @@
           <w:rFonts w:ascii="Verdana" w:hAnsi="Verdana"/>
         </w:rPr>
       </w:pPr>
+      <w:r>
+        <w:rPr>
+          <w:rFonts w:ascii="Verdana" w:hAnsi="Verdana"/>
+        </w:rPr>
+        <w:t xml:space="preserve">Containers and virtual machines are very similar resource virtualization technologies. Virtualization is the process in which a </w:t>
+      </w:r>
+      <w:proofErr w:type="gramStart"/>
+      <w:r>
+        <w:rPr>
+          <w:rFonts w:ascii="Verdana" w:hAnsi="Verdana"/>
+        </w:rPr>
+        <w:t>system</w:t>
+      </w:r>
+      <w:proofErr w:type="gramEnd"/>
+      <w:r>
+        <w:rPr>
+          <w:rFonts w:ascii="Verdana" w:hAnsi="Verdana"/>
+        </w:rPr>
+        <w:t xml:space="preserve"> singular </w:t>
+      </w:r>
+      <w:r>
+        <w:rPr>
+          <w:rFonts w:ascii="Verdana" w:hAnsi="Verdana"/>
+        </w:rPr>
+        <w:t>resources</w:t>
+      </w:r>
+      <w:r>
+        <w:rPr>
+          <w:rFonts w:ascii="Verdana" w:hAnsi="Verdana"/>
+        </w:rPr>
+        <w:t xml:space="preserve"> like RAM, CPU, Disk, or Networking can be ‘virtualized’ and represented as multiple resources. The key differentiator between containers and virtual machines is that virtual machines virtualize an entire machine down to the hardware layers and containers only virtualize software layers above the operating system level.</w:t>
+      </w:r>
+    </w:p>
+    <w:p>
+      <w:pPr>
+        <w:spacing w:before="100" w:beforeAutospacing="1" w:line="240" w:lineRule="auto"/>
+        <w:jc w:val="both"/>
+        <w:rPr>
+          <w:rFonts w:ascii="Verdana" w:hAnsi="Verdana"/>
+        </w:rPr>
+      </w:pPr>
+      <w:r>
+        <w:rPr>
+          <w:rFonts w:ascii="Verdana" w:hAnsi="Verdana"/>
+          <w:noProof/>
+        </w:rPr>
+        <w:drawing>
+          <wp:inline distT="0" distB="0" distL="0" distR="0" wp14:anchorId="25B20854" wp14:editId="0548158B">
+            <wp:extent cx="5909173" cy="2049744"/>
+            <wp:effectExtent l="0" t="0" r="0" b="8255"/>
+            <wp:docPr id="481475227" name="Picture 1"/>
+            <wp:cNvGraphicFramePr>
+              <a:graphicFrameLocks xmlns:a="http://schemas.openxmlformats.org/drawingml/2006/main" noChangeAspect="1"/>
+            </wp:cNvGraphicFramePr>
+            <a:graphic xmlns:a="http://schemas.openxmlformats.org/drawingml/2006/main">
+              <a:graphicData uri="http://schemas.openxmlformats.org/drawingml/2006/picture">
+                <pic:pic xmlns:pic="http://schemas.openxmlformats.org/drawingml/2006/picture">
+                  <pic:nvPicPr>
+                    <pic:cNvPr id="0" name="Picture 2"/>
+                    <pic:cNvPicPr>
+                      <a:picLocks noChangeAspect="1" noChangeArrowheads="1"/>
+                    </pic:cNvPicPr>
+                  </pic:nvPicPr>
+                  <pic:blipFill>
+                    <a:blip r:embed="rId5" cstate="print">
+                      <a:extLst>
+                        <a:ext uri="{28A0092B-C50C-407E-A947-70E740481C1C}">
+                          <a14:useLocalDpi xmlns:a14="http://schemas.microsoft.com/office/drawing/2010/main" val="0"/>
+                        </a:ext>
+                      </a:extLst>
+                    </a:blip>
+                    <a:srcRect/>
+                    <a:stretch>
+                      <a:fillRect/>
+                    </a:stretch>
+                  </pic:blipFill>
+                  <pic:spPr bwMode="auto">
+                    <a:xfrm>
+                      <a:off x="0" y="0"/>
+                      <a:ext cx="5963970" cy="2068752"/>
+                    </a:xfrm>
+                    <a:prstGeom prst="rect">
+                      <a:avLst/>
+                    </a:prstGeom>
+                    <a:noFill/>
+                  </pic:spPr>
+                </pic:pic>
+              </a:graphicData>
+            </a:graphic>
+          </wp:inline>
+        </w:drawing>
+      </w:r>
+    </w:p>
+    <w:p>
+      <w:pPr>
+        <w:spacing w:before="100" w:beforeAutospacing="1" w:line="240" w:lineRule="auto"/>
+        <w:jc w:val="both"/>
+        <w:rPr>
+          <w:rFonts w:ascii="Verdana" w:hAnsi="Verdana"/>
+        </w:rPr>
+      </w:pPr>
+      <w:r>
+        <w:rPr>
+          <w:rFonts w:ascii="Verdana" w:hAnsi="Verdana"/>
+        </w:rPr>
+        <w:t>To sum up, c</w:t>
+      </w:r>
+      <w:r>
+        <w:rPr>
+          <w:rFonts w:ascii="Verdana" w:hAnsi="Verdana"/>
+        </w:rPr>
+        <w:t>ontainers share the host OS kernel, while VMs emulate hardware to run separate OS instances. Containers are lighter and start faster; VMs offer stronger isolation.</w:t>
+      </w:r>
     </w:p>
     <w:p>
       <w:pPr>
@@ -548,6 +957,390 @@
           <w:rFonts w:ascii="Verdana" w:hAnsi="Verdana"/>
         </w:rPr>
       </w:pPr>
+      <w:r>
+        <w:rPr>
+          <w:rFonts w:ascii="Verdana" w:hAnsi="Verdana"/>
+        </w:rPr>
+        <w:t xml:space="preserve">1) </w:t>
+      </w:r>
+      <w:r>
+        <w:rPr>
+          <w:rFonts w:ascii="Verdana" w:hAnsi="Verdana"/>
+          <w:b/>
+          <w:bCs/>
+        </w:rPr>
+        <w:t>Build</w:t>
+      </w:r>
+      <w:r>
+        <w:rPr>
+          <w:rFonts w:ascii="Verdana" w:hAnsi="Verdana"/>
+        </w:rPr>
+        <w:t xml:space="preserve"> a Docker image for your app (docker build) and push it to a registry — Kubernetes will pull from there.</w:t>
+      </w:r>
+    </w:p>
+    <w:p>
+      <w:pPr>
+        <w:spacing w:before="100" w:beforeAutospacing="1" w:line="240" w:lineRule="auto"/>
+        <w:jc w:val="both"/>
+        <w:rPr>
+          <w:rFonts w:ascii="Verdana" w:hAnsi="Verdana"/>
+        </w:rPr>
+      </w:pPr>
+      <w:r>
+        <w:rPr>
+          <w:rFonts w:ascii="Verdana" w:hAnsi="Verdana"/>
+        </w:rPr>
+        <w:t>2</w:t>
+      </w:r>
+      <w:r>
+        <w:rPr>
+          <w:rFonts w:ascii="Verdana" w:hAnsi="Verdana"/>
+        </w:rPr>
+        <w:t>)</w:t>
+      </w:r>
+      <w:r>
+        <w:rPr>
+          <w:rFonts w:ascii="Verdana" w:hAnsi="Verdana"/>
+        </w:rPr>
+        <w:t xml:space="preserve"> </w:t>
+      </w:r>
+      <w:r>
+        <w:rPr>
+          <w:rFonts w:ascii="Verdana" w:hAnsi="Verdana"/>
+          <w:b/>
+          <w:bCs/>
+        </w:rPr>
+        <w:t>Containerize</w:t>
+      </w:r>
+      <w:r>
+        <w:rPr>
+          <w:rFonts w:ascii="Verdana" w:hAnsi="Verdana"/>
+        </w:rPr>
+        <w:t xml:space="preserve"> with Docker (same images).</w:t>
+      </w:r>
+    </w:p>
+    <w:p>
+      <w:pPr>
+        <w:spacing w:before="100" w:beforeAutospacing="1" w:line="240" w:lineRule="auto"/>
+        <w:jc w:val="both"/>
+        <w:rPr>
+          <w:rFonts w:ascii="Verdana" w:hAnsi="Verdana"/>
+        </w:rPr>
+      </w:pPr>
+      <w:r>
+        <w:rPr>
+          <w:rFonts w:ascii="Verdana" w:hAnsi="Verdana"/>
+        </w:rPr>
+        <w:lastRenderedPageBreak/>
+        <w:t>3</w:t>
+      </w:r>
+      <w:r>
+        <w:rPr>
+          <w:rFonts w:ascii="Verdana" w:hAnsi="Verdana"/>
+        </w:rPr>
+        <w:t>)</w:t>
+      </w:r>
+      <w:r>
+        <w:rPr>
+          <w:rFonts w:ascii="Verdana" w:hAnsi="Verdana"/>
+        </w:rPr>
+        <w:t xml:space="preserve"> </w:t>
+      </w:r>
+      <w:r>
+        <w:rPr>
+          <w:rFonts w:ascii="Verdana" w:hAnsi="Verdana"/>
+          <w:b/>
+          <w:bCs/>
+        </w:rPr>
+        <w:t>Write manifests</w:t>
+      </w:r>
+      <w:r>
+        <w:rPr>
+          <w:rFonts w:ascii="Verdana" w:hAnsi="Verdana"/>
+        </w:rPr>
+        <w:t xml:space="preserve"> (YAML): `Deployment` (pods + replicas), `Service` (stable networking/load balancing), `</w:t>
+      </w:r>
+      <w:proofErr w:type="spellStart"/>
+      <w:r>
+        <w:rPr>
+          <w:rFonts w:ascii="Verdana" w:hAnsi="Verdana"/>
+        </w:rPr>
+        <w:t>ConfigMap</w:t>
+      </w:r>
+      <w:proofErr w:type="spellEnd"/>
+      <w:r>
+        <w:rPr>
+          <w:rFonts w:ascii="Verdana" w:hAnsi="Verdana"/>
+        </w:rPr>
+        <w:t>`/`Secret` (config), `Ingress` (external routing), `</w:t>
+      </w:r>
+      <w:proofErr w:type="spellStart"/>
+      <w:r>
+        <w:rPr>
+          <w:rFonts w:ascii="Verdana" w:hAnsi="Verdana"/>
+        </w:rPr>
+        <w:t>PersistentVolumeClaim</w:t>
+      </w:r>
+      <w:proofErr w:type="spellEnd"/>
+      <w:r>
+        <w:rPr>
+          <w:rFonts w:ascii="Verdana" w:hAnsi="Verdana"/>
+        </w:rPr>
+        <w:t>` (storage), etc.</w:t>
+      </w:r>
+    </w:p>
+    <w:p>
+      <w:pPr>
+        <w:spacing w:before="100" w:beforeAutospacing="1" w:line="240" w:lineRule="auto"/>
+        <w:jc w:val="both"/>
+        <w:rPr>
+          <w:rFonts w:ascii="Verdana" w:hAnsi="Verdana"/>
+        </w:rPr>
+      </w:pPr>
+      <w:r>
+        <w:rPr>
+          <w:rFonts w:ascii="Verdana" w:hAnsi="Verdana"/>
+        </w:rPr>
+        <w:t>4</w:t>
+      </w:r>
+      <w:r>
+        <w:rPr>
+          <w:rFonts w:ascii="Verdana" w:hAnsi="Verdana"/>
+        </w:rPr>
+        <w:t>)</w:t>
+      </w:r>
+      <w:r>
+        <w:rPr>
+          <w:rFonts w:ascii="Verdana" w:hAnsi="Verdana"/>
+        </w:rPr>
+        <w:t xml:space="preserve"> </w:t>
+      </w:r>
+      <w:r>
+        <w:rPr>
+          <w:rFonts w:ascii="Verdana" w:hAnsi="Verdana"/>
+          <w:b/>
+          <w:bCs/>
+        </w:rPr>
+        <w:t>Apply</w:t>
+      </w:r>
+      <w:r>
+        <w:rPr>
+          <w:rFonts w:ascii="Verdana" w:hAnsi="Verdana"/>
+        </w:rPr>
+        <w:t xml:space="preserve"> – `</w:t>
+      </w:r>
+      <w:proofErr w:type="spellStart"/>
+      <w:r>
+        <w:rPr>
+          <w:rFonts w:ascii="Verdana" w:hAnsi="Verdana"/>
+        </w:rPr>
+        <w:t>kubectl</w:t>
+      </w:r>
+      <w:proofErr w:type="spellEnd"/>
+      <w:r>
+        <w:rPr>
+          <w:rFonts w:ascii="Verdana" w:hAnsi="Verdana"/>
+        </w:rPr>
+        <w:t xml:space="preserve"> apply -f`. You declare the </w:t>
+      </w:r>
+      <w:r>
+        <w:rPr>
+          <w:rFonts w:ascii="Verdana" w:hAnsi="Verdana"/>
+          <w:b/>
+          <w:bCs/>
+          <w:u w:val="single"/>
+        </w:rPr>
+        <w:t>desired state</w:t>
+      </w:r>
+      <w:r>
+        <w:rPr>
+          <w:rFonts w:ascii="Verdana" w:hAnsi="Verdana"/>
+        </w:rPr>
+        <w:t>.</w:t>
+      </w:r>
+    </w:p>
+    <w:p>
+      <w:pPr>
+        <w:spacing w:before="100" w:beforeAutospacing="1" w:line="240" w:lineRule="auto"/>
+        <w:jc w:val="both"/>
+        <w:rPr>
+          <w:rFonts w:ascii="Verdana" w:hAnsi="Verdana"/>
+        </w:rPr>
+      </w:pPr>
+      <w:r>
+        <w:rPr>
+          <w:rFonts w:ascii="Verdana" w:hAnsi="Verdana"/>
+        </w:rPr>
+        <w:t>5</w:t>
+      </w:r>
+      <w:r>
+        <w:rPr>
+          <w:rFonts w:ascii="Verdana" w:hAnsi="Verdana"/>
+        </w:rPr>
+        <w:t>)</w:t>
+      </w:r>
+      <w:r>
+        <w:rPr>
+          <w:rFonts w:ascii="Verdana" w:hAnsi="Verdana"/>
+        </w:rPr>
+        <w:t xml:space="preserve"> </w:t>
+      </w:r>
+      <w:r>
+        <w:rPr>
+          <w:rFonts w:ascii="Verdana" w:hAnsi="Verdana"/>
+          <w:b/>
+          <w:bCs/>
+        </w:rPr>
+        <w:t>Reconcile</w:t>
+      </w:r>
+      <w:r>
+        <w:rPr>
+          <w:rFonts w:ascii="Verdana" w:hAnsi="Verdana"/>
+        </w:rPr>
+        <w:t xml:space="preserve"> – the control plane (API server + scheduler + controllers) continuously schedules pods onto nodes and keeps actual state == desired state.</w:t>
+      </w:r>
+    </w:p>
+    <w:p>
+      <w:pPr>
+        <w:spacing w:before="100" w:beforeAutospacing="1" w:line="240" w:lineRule="auto"/>
+        <w:jc w:val="both"/>
+        <w:rPr>
+          <w:rFonts w:ascii="Verdana" w:hAnsi="Verdana"/>
+        </w:rPr>
+      </w:pPr>
+      <w:r>
+        <w:rPr>
+          <w:rFonts w:ascii="Verdana" w:hAnsi="Verdana"/>
+        </w:rPr>
+        <w:t>6</w:t>
+      </w:r>
+      <w:r>
+        <w:rPr>
+          <w:rFonts w:ascii="Verdana" w:hAnsi="Verdana"/>
+        </w:rPr>
+        <w:t>)</w:t>
+      </w:r>
+      <w:r>
+        <w:rPr>
+          <w:rFonts w:ascii="Verdana" w:hAnsi="Verdana"/>
+        </w:rPr>
+        <w:t xml:space="preserve"> </w:t>
+      </w:r>
+      <w:r>
+        <w:rPr>
+          <w:rFonts w:ascii="Verdana" w:hAnsi="Verdana"/>
+          <w:b/>
+          <w:bCs/>
+        </w:rPr>
+        <w:t>Operate</w:t>
+      </w:r>
+      <w:r>
+        <w:rPr>
+          <w:rFonts w:ascii="Verdana" w:hAnsi="Verdana"/>
+        </w:rPr>
+        <w:t xml:space="preserve"> – self-healing, `</w:t>
+      </w:r>
+      <w:proofErr w:type="spellStart"/>
+      <w:r>
+        <w:rPr>
+          <w:rFonts w:ascii="Verdana" w:hAnsi="Verdana"/>
+        </w:rPr>
+        <w:t>kubectl</w:t>
+      </w:r>
+      <w:proofErr w:type="spellEnd"/>
+      <w:r>
+        <w:rPr>
+          <w:rFonts w:ascii="Verdana" w:hAnsi="Verdana"/>
+        </w:rPr>
+        <w:t xml:space="preserve"> scale`, rolling updates (`</w:t>
+      </w:r>
+      <w:proofErr w:type="spellStart"/>
+      <w:r>
+        <w:rPr>
+          <w:rFonts w:ascii="Verdana" w:hAnsi="Verdana"/>
+        </w:rPr>
+        <w:t>kubectl</w:t>
+      </w:r>
+      <w:proofErr w:type="spellEnd"/>
+      <w:r>
+        <w:rPr>
+          <w:rFonts w:ascii="Verdana" w:hAnsi="Verdana"/>
+        </w:rPr>
+        <w:t xml:space="preserve"> rollout`), autoscaling (HPA), monitoring.</w:t>
+      </w:r>
+    </w:p>
+    <w:p>
+      <w:pPr>
+        <w:spacing w:before="100" w:beforeAutospacing="1" w:line="240" w:lineRule="auto"/>
+        <w:jc w:val="both"/>
+        <w:rPr>
+          <w:rFonts w:ascii="Verdana" w:hAnsi="Verdana"/>
+        </w:rPr>
+      </w:pPr>
+      <w:r>
+        <w:rPr>
+          <w:rFonts w:ascii="Verdana" w:hAnsi="Verdana"/>
+          <w:b/>
+          <w:bCs/>
+        </w:rPr>
+        <w:t>The mental model:</w:t>
+      </w:r>
+      <w:r>
+        <w:rPr>
+          <w:rFonts w:ascii="Verdana" w:hAnsi="Verdana"/>
+        </w:rPr>
+        <w:t xml:space="preserve"> Docker is </w:t>
+      </w:r>
+      <w:r>
+        <w:rPr>
+          <w:rFonts w:ascii="Verdana" w:hAnsi="Verdana"/>
+          <w:b/>
+          <w:bCs/>
+          <w:u w:val="single"/>
+        </w:rPr>
+        <w:t xml:space="preserve">imperative and </w:t>
+      </w:r>
+      <w:proofErr w:type="gramStart"/>
+      <w:r>
+        <w:rPr>
+          <w:rFonts w:ascii="Verdana" w:hAnsi="Verdana"/>
+          <w:b/>
+          <w:bCs/>
+          <w:u w:val="single"/>
+        </w:rPr>
+        <w:t>single-host</w:t>
+      </w:r>
+      <w:proofErr w:type="gramEnd"/>
+      <w:r>
+        <w:rPr>
+          <w:rFonts w:ascii="Verdana" w:hAnsi="Verdana"/>
+        </w:rPr>
+        <w:t xml:space="preserve"> ("run this container now"); Kubernetes is </w:t>
+      </w:r>
+      <w:r>
+        <w:rPr>
+          <w:rFonts w:ascii="Verdana" w:hAnsi="Verdana"/>
+          <w:b/>
+          <w:bCs/>
+          <w:u w:val="single"/>
+        </w:rPr>
+        <w:t>declarative and multi-host</w:t>
+      </w:r>
+      <w:r>
+        <w:rPr>
+          <w:rFonts w:ascii="Verdana" w:hAnsi="Verdana"/>
+        </w:rPr>
+        <w:t xml:space="preserve"> ("always keep 3 healthy replicas of this, behind this service"). Docker builds the artifact; Kubernetes runs it at scale in production.</w:t>
+      </w:r>
+    </w:p>
+    <w:p>
+      <w:pPr>
+        <w:spacing w:before="100" w:beforeAutospacing="1" w:line="240" w:lineRule="auto"/>
+        <w:jc w:val="both"/>
+        <w:rPr>
+          <w:rFonts w:ascii="Verdana" w:hAnsi="Verdana"/>
+        </w:rPr>
+      </w:pPr>
     </w:p>
     <w:p>
       <w:pPr>
@@ -578,19 +1371,2072 @@
           <w:rFonts w:ascii="Verdana" w:hAnsi="Verdana"/>
         </w:rPr>
       </w:pPr>
-    </w:p>
-    <w:p>
-      <w:pPr>
-        <w:spacing w:before="100" w:beforeAutospacing="1" w:line="240" w:lineRule="auto"/>
-        <w:jc w:val="both"/>
-        <w:rPr>
-          <w:rFonts w:ascii="Verdana" w:hAnsi="Verdana"/>
-        </w:rPr>
-      </w:pPr>
-      <w:r>
-        <w:rPr>
-          <w:rFonts w:ascii="Verdana" w:hAnsi="Verdana"/>
-        </w:rPr>
+      <w:r>
+        <w:rPr>
+          <w:rFonts w:ascii="Verdana" w:hAnsi="Verdana"/>
+        </w:rPr>
+        <w:t xml:space="preserve">5.1 </w:t>
+      </w:r>
+      <w:r>
+        <w:rPr>
+          <w:rFonts w:ascii="Verdana" w:hAnsi="Verdana"/>
+        </w:rPr>
+        <w:t>Containerization best practices for migrating applications into containers</w:t>
+      </w:r>
+    </w:p>
+    <w:p>
+      <w:pPr>
+        <w:spacing w:before="100" w:beforeAutospacing="1" w:line="240" w:lineRule="auto"/>
+        <w:jc w:val="both"/>
+        <w:rPr>
+          <w:rFonts w:ascii="Verdana" w:hAnsi="Verdana"/>
+          <w:b/>
+          <w:bCs/>
+        </w:rPr>
+      </w:pPr>
+      <w:r>
+        <w:rPr>
+          <w:rFonts w:ascii="Verdana" w:hAnsi="Verdana"/>
+          <w:b/>
+          <w:bCs/>
+        </w:rPr>
+        <w:t>Have a long-term vision</w:t>
+      </w:r>
+    </w:p>
+    <w:p>
+      <w:pPr>
+        <w:spacing w:before="100" w:beforeAutospacing="1" w:line="240" w:lineRule="auto"/>
+        <w:jc w:val="both"/>
+        <w:rPr>
+          <w:rFonts w:ascii="Verdana" w:hAnsi="Verdana"/>
+        </w:rPr>
+      </w:pPr>
+      <w:r>
+        <w:rPr>
+          <w:rFonts w:ascii="Verdana" w:hAnsi="Verdana"/>
+        </w:rPr>
+        <w:t>Moving to containers just for its sake can introduce more technical challenges based on the applications and the teams running them. However, a clear and long-term vision enables teams to focus on innovation and adopting best practices for the applications.</w:t>
+      </w:r>
+    </w:p>
+    <w:p>
+      <w:pPr>
+        <w:spacing w:before="100" w:beforeAutospacing="1" w:line="240" w:lineRule="auto"/>
+        <w:jc w:val="both"/>
+        <w:rPr>
+          <w:rFonts w:ascii="Verdana" w:hAnsi="Verdana"/>
+        </w:rPr>
+      </w:pPr>
+      <w:r>
+        <w:rPr>
+          <w:rFonts w:ascii="Verdana" w:hAnsi="Verdana"/>
+        </w:rPr>
+        <w:t xml:space="preserve">It is more fruitful to containerize an app that is large or web-scale and has inherent statelessness in the architecture. Also, ensure that its business requirements include </w:t>
+      </w:r>
+      <w:r>
+        <w:rPr>
+          <w:rFonts w:ascii="Verdana" w:hAnsi="Verdana"/>
+        </w:rPr>
+        <w:t>high</w:t>
+      </w:r>
+      <w:r>
+        <w:rPr>
+          <w:rFonts w:ascii="Verdana" w:hAnsi="Verdana"/>
+        </w:rPr>
+        <w:t>-quality user experience and a high frequency of releases and updates.</w:t>
+      </w:r>
+    </w:p>
+    <w:p>
+      <w:pPr>
+        <w:spacing w:before="100" w:beforeAutospacing="1" w:line="240" w:lineRule="auto"/>
+        <w:jc w:val="both"/>
+        <w:rPr>
+          <w:rFonts w:ascii="Verdana" w:hAnsi="Verdana"/>
+        </w:rPr>
+      </w:pPr>
+      <w:r>
+        <w:rPr>
+          <w:rFonts w:ascii="Verdana" w:hAnsi="Verdana"/>
+        </w:rPr>
+        <w:t>Importance: High</w:t>
+      </w:r>
+    </w:p>
+    <w:p>
+      <w:pPr>
+        <w:spacing w:before="100" w:beforeAutospacing="1" w:line="240" w:lineRule="auto"/>
+        <w:jc w:val="both"/>
+        <w:rPr>
+          <w:rFonts w:ascii="Verdana" w:hAnsi="Verdana"/>
+        </w:rPr>
+      </w:pPr>
+    </w:p>
+    <w:p>
+      <w:pPr>
+        <w:spacing w:before="100" w:beforeAutospacing="1" w:line="240" w:lineRule="auto"/>
+        <w:jc w:val="both"/>
+        <w:rPr>
+          <w:rFonts w:ascii="Verdana" w:hAnsi="Verdana"/>
+          <w:b/>
+          <w:bCs/>
+        </w:rPr>
+      </w:pPr>
+      <w:r>
+        <w:rPr>
+          <w:rFonts w:ascii="Verdana" w:hAnsi="Verdana"/>
+          <w:b/>
+          <w:bCs/>
+        </w:rPr>
+        <w:t>Select the right migration strategy</w:t>
+      </w:r>
+    </w:p>
+    <w:p>
+      <w:pPr>
+        <w:spacing w:before="100" w:beforeAutospacing="1" w:line="240" w:lineRule="auto"/>
+        <w:jc w:val="both"/>
+        <w:rPr>
+          <w:rFonts w:ascii="Verdana" w:hAnsi="Verdana"/>
+        </w:rPr>
+      </w:pPr>
+      <w:r>
+        <w:rPr>
+          <w:rFonts w:ascii="Verdana" w:hAnsi="Verdana"/>
+        </w:rPr>
+        <w:t>There are three main strategies for app migration: lift and shift, augment, and rewrite. Often, teams containerize a monolithic application to achieve a “lift-</w:t>
+      </w:r>
+      <w:r>
+        <w:rPr>
+          <w:rFonts w:ascii="Verdana" w:hAnsi="Verdana"/>
+        </w:rPr>
+        <w:lastRenderedPageBreak/>
+        <w:t>and-shift” from an on-premises environment to a public cloud. But, again, it is better to ensure the proper selection.</w:t>
+      </w:r>
+    </w:p>
+    <w:p>
+      <w:pPr>
+        <w:spacing w:before="100" w:beforeAutospacing="1" w:line="240" w:lineRule="auto"/>
+        <w:jc w:val="both"/>
+        <w:rPr>
+          <w:rFonts w:ascii="Verdana" w:hAnsi="Verdana"/>
+        </w:rPr>
+      </w:pPr>
+      <w:r>
+        <w:rPr>
+          <w:rFonts w:ascii="Verdana" w:hAnsi="Verdana"/>
+        </w:rPr>
+        <w:t>Refactoring an application is also a great choice. An application generally consists of smaller units. Packaging those units into something easily consumable makes the migration and containerized deployments rapid and smoother. Again, this ought to bring microservices into the picture.</w:t>
+      </w:r>
+    </w:p>
+    <w:p>
+      <w:pPr>
+        <w:spacing w:before="100" w:beforeAutospacing="1" w:line="240" w:lineRule="auto"/>
+        <w:jc w:val="both"/>
+        <w:rPr>
+          <w:rFonts w:ascii="Verdana" w:hAnsi="Verdana"/>
+        </w:rPr>
+      </w:pPr>
+      <w:r>
+        <w:rPr>
+          <w:rFonts w:ascii="Verdana" w:hAnsi="Verdana"/>
+        </w:rPr>
+        <w:t>Importance: High</w:t>
+      </w:r>
+    </w:p>
+    <w:p>
+      <w:pPr>
+        <w:spacing w:before="100" w:beforeAutospacing="1" w:line="240" w:lineRule="auto"/>
+        <w:jc w:val="both"/>
+        <w:rPr>
+          <w:rFonts w:ascii="Verdana" w:hAnsi="Verdana"/>
+        </w:rPr>
+      </w:pPr>
+    </w:p>
+    <w:p>
+      <w:pPr>
+        <w:spacing w:before="100" w:beforeAutospacing="1" w:line="240" w:lineRule="auto"/>
+        <w:jc w:val="both"/>
+        <w:rPr>
+          <w:rFonts w:ascii="Verdana" w:hAnsi="Verdana"/>
+          <w:b/>
+          <w:bCs/>
+        </w:rPr>
+      </w:pPr>
+      <w:r>
+        <w:rPr>
+          <w:rFonts w:ascii="Verdana" w:hAnsi="Verdana"/>
+          <w:b/>
+          <w:bCs/>
+        </w:rPr>
+        <w:t>Consider decomposing part of older applications first</w:t>
+      </w:r>
+    </w:p>
+    <w:p>
+      <w:pPr>
+        <w:spacing w:before="100" w:beforeAutospacing="1" w:line="240" w:lineRule="auto"/>
+        <w:jc w:val="both"/>
+        <w:rPr>
+          <w:rFonts w:ascii="Verdana" w:hAnsi="Verdana"/>
+        </w:rPr>
+      </w:pPr>
+      <w:r>
+        <w:rPr>
+          <w:rFonts w:ascii="Verdana" w:hAnsi="Verdana"/>
+        </w:rPr>
+        <w:t>Newer applications might be easier to maintain and update than older ones. Therefore, moving the newer ones first might seem like an easier option. However, there might be a more significant payoff in decomposing parts of older applications that are causing operational pain. Later, you can deploy these new services as containers without revamping the entire application.</w:t>
+      </w:r>
+    </w:p>
+    <w:p>
+      <w:pPr>
+        <w:spacing w:before="100" w:beforeAutospacing="1" w:line="240" w:lineRule="auto"/>
+        <w:jc w:val="both"/>
+        <w:rPr>
+          <w:rFonts w:ascii="Verdana" w:hAnsi="Verdana"/>
+        </w:rPr>
+      </w:pPr>
+      <w:r>
+        <w:rPr>
+          <w:rFonts w:ascii="Verdana" w:hAnsi="Verdana"/>
+        </w:rPr>
+        <w:t>Importance: Medium</w:t>
+      </w:r>
+    </w:p>
+    <w:p>
+      <w:pPr>
+        <w:spacing w:before="100" w:beforeAutospacing="1" w:line="240" w:lineRule="auto"/>
+        <w:jc w:val="both"/>
+        <w:rPr>
+          <w:rFonts w:ascii="Verdana" w:hAnsi="Verdana"/>
+        </w:rPr>
+      </w:pPr>
+    </w:p>
+    <w:p>
+      <w:pPr>
+        <w:spacing w:before="100" w:beforeAutospacing="1" w:line="240" w:lineRule="auto"/>
+        <w:jc w:val="both"/>
+        <w:rPr>
+          <w:rFonts w:ascii="Verdana" w:hAnsi="Verdana"/>
+        </w:rPr>
+      </w:pPr>
+      <w:r>
+        <w:rPr>
+          <w:rFonts w:ascii="Verdana" w:hAnsi="Verdana"/>
+        </w:rPr>
+        <w:t xml:space="preserve">5.2 </w:t>
+      </w:r>
+      <w:proofErr w:type="gramStart"/>
+      <w:r>
+        <w:rPr>
+          <w:rFonts w:ascii="Verdana" w:hAnsi="Verdana"/>
+        </w:rPr>
+        <w:t>Containerization</w:t>
+      </w:r>
+      <w:proofErr w:type="gramEnd"/>
+      <w:r>
+        <w:rPr>
+          <w:rFonts w:ascii="Verdana" w:hAnsi="Verdana"/>
+        </w:rPr>
+        <w:t xml:space="preserve"> best practices for building containers</w:t>
+      </w:r>
+      <w:r>
+        <w:rPr>
+          <w:rFonts w:ascii="Verdana" w:hAnsi="Verdana"/>
+        </w:rPr>
+        <w:t>:</w:t>
+      </w:r>
+    </w:p>
+    <w:p>
+      <w:pPr>
+        <w:spacing w:before="100" w:beforeAutospacing="1" w:line="240" w:lineRule="auto"/>
+        <w:jc w:val="both"/>
+        <w:rPr>
+          <w:rFonts w:ascii="Verdana" w:hAnsi="Verdana"/>
+        </w:rPr>
+      </w:pPr>
+      <w:r>
+        <w:rPr>
+          <w:rFonts w:ascii="Verdana" w:hAnsi="Verdana"/>
+        </w:rPr>
+        <w:t>Your first step while building containers would naturally be to build teams that design, build, innovate, and operate a container management platform. You should consider investing in a DevOps team and site reliability engineers (SREs) depending on your application’s size and complexity.</w:t>
+      </w:r>
+    </w:p>
+    <w:p>
+      <w:pPr>
+        <w:spacing w:before="100" w:beforeAutospacing="1" w:line="240" w:lineRule="auto"/>
+        <w:jc w:val="both"/>
+        <w:rPr>
+          <w:rFonts w:ascii="Verdana" w:hAnsi="Verdana"/>
+        </w:rPr>
+      </w:pPr>
+      <w:r>
+        <w:rPr>
+          <w:rFonts w:ascii="Verdana" w:hAnsi="Verdana"/>
+        </w:rPr>
+        <w:t>Here are the best practices for building containers.</w:t>
+      </w:r>
+    </w:p>
+    <w:p>
+      <w:pPr>
+        <w:spacing w:before="100" w:beforeAutospacing="1" w:line="240" w:lineRule="auto"/>
+        <w:jc w:val="both"/>
+        <w:rPr>
+          <w:rFonts w:ascii="Verdana" w:hAnsi="Verdana"/>
+          <w:b/>
+          <w:bCs/>
+        </w:rPr>
+      </w:pPr>
+      <w:r>
+        <w:rPr>
+          <w:rFonts w:ascii="Verdana" w:hAnsi="Verdana"/>
+          <w:b/>
+          <w:bCs/>
+        </w:rPr>
+        <w:t>A single application per container</w:t>
+      </w:r>
+    </w:p>
+    <w:p>
+      <w:pPr>
+        <w:spacing w:before="100" w:beforeAutospacing="1" w:line="240" w:lineRule="auto"/>
+        <w:jc w:val="both"/>
+        <w:rPr>
+          <w:rFonts w:ascii="Verdana" w:hAnsi="Verdana"/>
+        </w:rPr>
+      </w:pPr>
+      <w:r>
+        <w:rPr>
+          <w:rFonts w:ascii="Verdana" w:hAnsi="Verdana"/>
+        </w:rPr>
+        <w:t>When starting to work with containers, it’s common to treat them as VMs that can run different things simultaneously. A container can work this way, but that won’t give all the advantages. Also, it is tempting to run every component in a single container.</w:t>
+      </w:r>
+    </w:p>
+    <w:p>
+      <w:pPr>
+        <w:spacing w:before="100" w:beforeAutospacing="1" w:line="240" w:lineRule="auto"/>
+        <w:jc w:val="both"/>
+        <w:rPr>
+          <w:rFonts w:ascii="Verdana" w:hAnsi="Verdana"/>
+        </w:rPr>
+      </w:pPr>
+      <w:r>
+        <w:rPr>
+          <w:rFonts w:ascii="Verdana" w:hAnsi="Verdana"/>
+        </w:rPr>
+        <w:t xml:space="preserve">However, as the containers have the same lifecycle as the app that it hosts, each container should contain a single app. So, the app should work when a container starts and </w:t>
+      </w:r>
+      <w:proofErr w:type="gramStart"/>
+      <w:r>
+        <w:rPr>
+          <w:rFonts w:ascii="Verdana" w:hAnsi="Verdana"/>
+        </w:rPr>
+        <w:t>stop</w:t>
+      </w:r>
+      <w:proofErr w:type="gramEnd"/>
+      <w:r>
+        <w:rPr>
+          <w:rFonts w:ascii="Verdana" w:hAnsi="Verdana"/>
+        </w:rPr>
+        <w:t xml:space="preserve"> when the container stops. Here, an “app” must be </w:t>
+      </w:r>
+      <w:r>
+        <w:rPr>
+          <w:rFonts w:ascii="Verdana" w:hAnsi="Verdana"/>
+        </w:rPr>
+        <w:lastRenderedPageBreak/>
+        <w:t>software with a distinctive parent process and several child processes. This image shows the best practice.</w:t>
+      </w:r>
+    </w:p>
+    <w:p>
+      <w:pPr>
+        <w:spacing w:before="100" w:beforeAutospacing="1" w:line="240" w:lineRule="auto"/>
+        <w:jc w:val="both"/>
+        <w:rPr>
+          <w:rFonts w:ascii="Verdana" w:hAnsi="Verdana"/>
+        </w:rPr>
+      </w:pPr>
+      <w:r>
+        <w:rPr>
+          <w:rFonts w:ascii="Verdana" w:hAnsi="Verdana"/>
+        </w:rPr>
+        <w:t>Importance: High</w:t>
+      </w:r>
+    </w:p>
+    <w:p>
+      <w:pPr>
+        <w:spacing w:before="100" w:beforeAutospacing="1" w:line="240" w:lineRule="auto"/>
+        <w:jc w:val="both"/>
+        <w:rPr>
+          <w:rFonts w:ascii="Verdana" w:hAnsi="Verdana"/>
+        </w:rPr>
+      </w:pPr>
+      <w:r>
+        <w:rPr>
+          <w:rFonts w:ascii="Verdana" w:hAnsi="Verdana"/>
+          <w:noProof/>
+        </w:rPr>
+        <w:drawing>
+          <wp:inline distT="0" distB="0" distL="0" distR="0" wp14:anchorId="7B801155" wp14:editId="2751E7E4">
+            <wp:extent cx="5870302" cy="2779809"/>
+            <wp:effectExtent l="0" t="0" r="0" b="1905"/>
+            <wp:docPr id="602535771" name="Picture 3"/>
+            <wp:cNvGraphicFramePr>
+              <a:graphicFrameLocks xmlns:a="http://schemas.openxmlformats.org/drawingml/2006/main" noChangeAspect="1"/>
+            </wp:cNvGraphicFramePr>
+            <a:graphic xmlns:a="http://schemas.openxmlformats.org/drawingml/2006/main">
+              <a:graphicData uri="http://schemas.openxmlformats.org/drawingml/2006/picture">
+                <pic:pic xmlns:pic="http://schemas.openxmlformats.org/drawingml/2006/picture">
+                  <pic:nvPicPr>
+                    <pic:cNvPr id="0" name="Picture 3"/>
+                    <pic:cNvPicPr>
+                      <a:picLocks noChangeAspect="1" noChangeArrowheads="1"/>
+                    </pic:cNvPicPr>
+                  </pic:nvPicPr>
+                  <pic:blipFill>
+                    <a:blip r:embed="rId6" cstate="print">
+                      <a:extLst>
+                        <a:ext uri="{28A0092B-C50C-407E-A947-70E740481C1C}">
+                          <a14:useLocalDpi xmlns:a14="http://schemas.microsoft.com/office/drawing/2010/main" val="0"/>
+                        </a:ext>
+                      </a:extLst>
+                    </a:blip>
+                    <a:srcRect/>
+                    <a:stretch>
+                      <a:fillRect/>
+                    </a:stretch>
+                  </pic:blipFill>
+                  <pic:spPr bwMode="auto">
+                    <a:xfrm>
+                      <a:off x="0" y="0"/>
+                      <a:ext cx="5900779" cy="2794241"/>
+                    </a:xfrm>
+                    <a:prstGeom prst="rect">
+                      <a:avLst/>
+                    </a:prstGeom>
+                    <a:noFill/>
+                  </pic:spPr>
+                </pic:pic>
+              </a:graphicData>
+            </a:graphic>
+          </wp:inline>
+        </w:drawing>
+      </w:r>
+    </w:p>
+    <w:p>
+      <w:pPr>
+        <w:spacing w:before="100" w:beforeAutospacing="1" w:line="240" w:lineRule="auto"/>
+        <w:jc w:val="both"/>
+        <w:rPr>
+          <w:rFonts w:ascii="Verdana" w:hAnsi="Verdana"/>
+        </w:rPr>
+      </w:pPr>
+      <w:r>
+        <w:rPr>
+          <w:rFonts w:ascii="Verdana" w:hAnsi="Verdana"/>
+        </w:rPr>
+        <w:t xml:space="preserve">5.3 </w:t>
+      </w:r>
+      <w:r>
+        <w:rPr>
+          <w:rFonts w:ascii="Verdana" w:hAnsi="Verdana"/>
+        </w:rPr>
+        <w:t>Container Image Best Practices</w:t>
+      </w:r>
+    </w:p>
+    <w:p>
+      <w:pPr>
+        <w:spacing w:before="100" w:beforeAutospacing="1" w:line="240" w:lineRule="auto"/>
+        <w:jc w:val="both"/>
+        <w:rPr>
+          <w:rFonts w:ascii="Verdana" w:hAnsi="Verdana"/>
+          <w:b/>
+          <w:bCs/>
+        </w:rPr>
+      </w:pPr>
+      <w:r>
+        <w:rPr>
+          <w:rFonts w:ascii="Verdana" w:hAnsi="Verdana"/>
+          <w:b/>
+          <w:bCs/>
+        </w:rPr>
+        <w:t>Consider starting with stateless applications</w:t>
+      </w:r>
+    </w:p>
+    <w:p>
+      <w:pPr>
+        <w:spacing w:before="100" w:beforeAutospacing="1" w:line="240" w:lineRule="auto"/>
+        <w:jc w:val="both"/>
+        <w:rPr>
+          <w:rFonts w:ascii="Verdana" w:hAnsi="Verdana"/>
+        </w:rPr>
+      </w:pPr>
+      <w:r>
+        <w:rPr>
+          <w:rFonts w:ascii="Verdana" w:hAnsi="Verdana"/>
+        </w:rPr>
+        <w:t>Despite stateless apps having the overhead of the call to the database, they are excellent at horizontally scaling, which is essential for modern apps. Also, A stateless backend eliminates the possibilities of long-running connections and mutable states and enables easy deployment of applications with zero downtime.</w:t>
+      </w:r>
+    </w:p>
+    <w:p>
+      <w:pPr>
+        <w:spacing w:before="100" w:beforeAutospacing="1" w:line="240" w:lineRule="auto"/>
+        <w:jc w:val="both"/>
+        <w:rPr>
+          <w:rFonts w:ascii="Verdana" w:hAnsi="Verdana"/>
+        </w:rPr>
+      </w:pPr>
+      <w:r>
+        <w:rPr>
+          <w:rFonts w:ascii="Verdana" w:hAnsi="Verdana"/>
+        </w:rPr>
+        <w:t>Importance: Medium</w:t>
+      </w:r>
+    </w:p>
+    <w:p>
+      <w:pPr>
+        <w:tabs>
+          <w:tab w:val="left" w:pos="1495"/>
+        </w:tabs>
+        <w:spacing w:before="100" w:beforeAutospacing="1" w:line="240" w:lineRule="auto"/>
+        <w:rPr>
+          <w:rFonts w:ascii="Verdana" w:hAnsi="Verdana"/>
+        </w:rPr>
+      </w:pPr>
+    </w:p>
+    <w:p>
+      <w:pPr>
+        <w:spacing w:before="100" w:beforeAutospacing="1" w:line="240" w:lineRule="auto"/>
+        <w:jc w:val="both"/>
+        <w:rPr>
+          <w:rFonts w:ascii="Verdana" w:hAnsi="Verdana"/>
+          <w:b/>
+          <w:bCs/>
+        </w:rPr>
+      </w:pPr>
+      <w:r>
+        <w:rPr>
+          <w:rFonts w:ascii="Verdana" w:hAnsi="Verdana"/>
+          <w:b/>
+          <w:bCs/>
+        </w:rPr>
+        <w:t>Optimize your builds for the build cache</w:t>
+      </w:r>
+    </w:p>
+    <w:p>
+      <w:pPr>
+        <w:spacing w:before="100" w:beforeAutospacing="1" w:line="240" w:lineRule="auto"/>
+        <w:jc w:val="both"/>
+        <w:rPr>
+          <w:rFonts w:ascii="Verdana" w:hAnsi="Verdana"/>
+        </w:rPr>
+      </w:pPr>
+      <w:r>
+        <w:rPr>
+          <w:rFonts w:ascii="Verdana" w:hAnsi="Verdana"/>
+        </w:rPr>
+        <w:t xml:space="preserve">Containers like Docker </w:t>
+      </w:r>
+      <w:proofErr w:type="gramStart"/>
+      <w:r>
+        <w:rPr>
+          <w:rFonts w:ascii="Verdana" w:hAnsi="Verdana"/>
+        </w:rPr>
+        <w:t>caches</w:t>
+      </w:r>
+      <w:proofErr w:type="gramEnd"/>
+      <w:r>
+        <w:rPr>
+          <w:rFonts w:ascii="Verdana" w:hAnsi="Verdana"/>
+        </w:rPr>
+        <w:t xml:space="preserve"> the results of the first build of a </w:t>
+      </w:r>
+      <w:proofErr w:type="spellStart"/>
+      <w:r>
+        <w:rPr>
+          <w:rFonts w:ascii="Verdana" w:hAnsi="Verdana"/>
+        </w:rPr>
+        <w:t>Dockerfile</w:t>
+      </w:r>
+      <w:proofErr w:type="spellEnd"/>
+      <w:r>
+        <w:rPr>
+          <w:rFonts w:ascii="Verdana" w:hAnsi="Verdana"/>
+        </w:rPr>
+        <w:t xml:space="preserve">, saving individual layers of the Docker images that can be reused in subsequent pipeline runs. This reduced build time decreases production cost too, which is particularly helpful when building multiple containers. Hence, Docker layer </w:t>
+      </w:r>
+      <w:proofErr w:type="gramStart"/>
+      <w:r>
+        <w:rPr>
+          <w:rFonts w:ascii="Verdana" w:hAnsi="Verdana"/>
+        </w:rPr>
+        <w:t>caching</w:t>
+      </w:r>
+      <w:proofErr w:type="gramEnd"/>
+      <w:r>
+        <w:rPr>
+          <w:rFonts w:ascii="Verdana" w:hAnsi="Verdana"/>
+        </w:rPr>
+        <w:t xml:space="preserve"> (DLC) is one of Docker’s best practices for speeding up your workflows.</w:t>
+      </w:r>
+    </w:p>
+    <w:p>
+      <w:pPr>
+        <w:spacing w:before="100" w:beforeAutospacing="1" w:line="240" w:lineRule="auto"/>
+        <w:jc w:val="both"/>
+        <w:rPr>
+          <w:rFonts w:ascii="Verdana" w:hAnsi="Verdana"/>
+        </w:rPr>
+      </w:pPr>
+      <w:r>
+        <w:rPr>
+          <w:rFonts w:ascii="Verdana" w:hAnsi="Verdana"/>
+        </w:rPr>
+        <w:lastRenderedPageBreak/>
+        <w:t>Importance: High</w:t>
+      </w:r>
+    </w:p>
+    <w:p>
+      <w:pPr>
+        <w:spacing w:before="100" w:beforeAutospacing="1" w:line="240" w:lineRule="auto"/>
+        <w:jc w:val="both"/>
+        <w:rPr>
+          <w:rFonts w:ascii="Verdana" w:hAnsi="Verdana"/>
+        </w:rPr>
+      </w:pPr>
+    </w:p>
+    <w:p>
+      <w:pPr>
+        <w:spacing w:before="100" w:beforeAutospacing="1" w:line="240" w:lineRule="auto"/>
+        <w:jc w:val="both"/>
+        <w:rPr>
+          <w:rFonts w:ascii="Verdana" w:hAnsi="Verdana"/>
+          <w:b/>
+          <w:bCs/>
+        </w:rPr>
+      </w:pPr>
+      <w:r>
+        <w:rPr>
+          <w:rFonts w:ascii="Verdana" w:hAnsi="Verdana"/>
+          <w:b/>
+          <w:bCs/>
+        </w:rPr>
+        <w:t>Plan for monitoring from the start</w:t>
+      </w:r>
+    </w:p>
+    <w:p>
+      <w:pPr>
+        <w:spacing w:before="100" w:beforeAutospacing="1" w:line="240" w:lineRule="auto"/>
+        <w:jc w:val="both"/>
+        <w:rPr>
+          <w:rFonts w:ascii="Verdana" w:hAnsi="Verdana"/>
+        </w:rPr>
+      </w:pPr>
+      <w:proofErr w:type="gramStart"/>
+      <w:r>
+        <w:rPr>
+          <w:rFonts w:ascii="Verdana" w:hAnsi="Verdana"/>
+        </w:rPr>
+        <w:t>Containers</w:t>
+      </w:r>
+      <w:proofErr w:type="gramEnd"/>
+      <w:r>
+        <w:rPr>
+          <w:rFonts w:ascii="Verdana" w:hAnsi="Verdana"/>
+        </w:rPr>
+        <w:t xml:space="preserve"> being ephemeral in nature, are difficult to monitor. However, monitoring is quite essential to ensure performance, availability, and security for containerized workloads. With a comprehensive approach to monitoring, you can have greater visibility into issues and events and remediate the problems before </w:t>
+      </w:r>
+      <w:proofErr w:type="gramStart"/>
+      <w:r>
+        <w:rPr>
+          <w:rFonts w:ascii="Verdana" w:hAnsi="Verdana"/>
+        </w:rPr>
+        <w:t>they can</w:t>
+      </w:r>
+      <w:proofErr w:type="gramEnd"/>
+      <w:r>
+        <w:rPr>
+          <w:rFonts w:ascii="Verdana" w:hAnsi="Verdana"/>
+        </w:rPr>
+        <w:t xml:space="preserve"> impact the users.</w:t>
+      </w:r>
+    </w:p>
+    <w:p>
+      <w:pPr>
+        <w:spacing w:before="100" w:beforeAutospacing="1" w:line="240" w:lineRule="auto"/>
+        <w:jc w:val="both"/>
+        <w:rPr>
+          <w:rFonts w:ascii="Verdana" w:hAnsi="Verdana"/>
+        </w:rPr>
+      </w:pPr>
+      <w:r>
+        <w:rPr>
+          <w:rFonts w:ascii="Verdana" w:hAnsi="Verdana"/>
+        </w:rPr>
+        <w:t>Importance: High</w:t>
+      </w:r>
+    </w:p>
+    <w:p>
+      <w:pPr>
+        <w:spacing w:before="100" w:beforeAutospacing="1" w:line="240" w:lineRule="auto"/>
+        <w:jc w:val="both"/>
+        <w:rPr>
+          <w:rFonts w:ascii="Verdana" w:hAnsi="Verdana"/>
+        </w:rPr>
+      </w:pPr>
+    </w:p>
+    <w:p>
+      <w:pPr>
+        <w:spacing w:before="100" w:beforeAutospacing="1" w:line="240" w:lineRule="auto"/>
+        <w:jc w:val="both"/>
+        <w:rPr>
+          <w:rFonts w:ascii="Verdana" w:hAnsi="Verdana"/>
+        </w:rPr>
+      </w:pPr>
+      <w:r>
+        <w:rPr>
+          <w:rFonts w:ascii="Verdana" w:hAnsi="Verdana"/>
+        </w:rPr>
+        <w:t xml:space="preserve">5.4 </w:t>
+      </w:r>
+      <w:r>
+        <w:rPr>
+          <w:rFonts w:ascii="Verdana" w:hAnsi="Verdana"/>
+        </w:rPr>
+        <w:t>Containerization best practices for creating container images</w:t>
+      </w:r>
+    </w:p>
+    <w:p>
+      <w:pPr>
+        <w:spacing w:before="100" w:beforeAutospacing="1" w:line="240" w:lineRule="auto"/>
+        <w:jc w:val="both"/>
+        <w:rPr>
+          <w:rFonts w:ascii="Verdana" w:hAnsi="Verdana"/>
+        </w:rPr>
+      </w:pPr>
+      <w:r>
+        <w:rPr>
+          <w:rFonts w:ascii="Verdana" w:hAnsi="Verdana"/>
+        </w:rPr>
+        <w:t>A container image is at the heart of containerized architecture. It is a static, immutable file with executable code, which can create a container on a computing system.</w:t>
+      </w:r>
+    </w:p>
+    <w:p>
+      <w:pPr>
+        <w:spacing w:before="100" w:beforeAutospacing="1" w:line="240" w:lineRule="auto"/>
+        <w:jc w:val="both"/>
+        <w:rPr>
+          <w:rFonts w:ascii="Verdana" w:hAnsi="Verdana"/>
+        </w:rPr>
+      </w:pPr>
+      <w:r>
+        <w:rPr>
+          <w:rFonts w:ascii="Verdana" w:hAnsi="Verdana"/>
+        </w:rPr>
+        <w:t>You can build docker container images in three ways,</w:t>
+      </w:r>
+    </w:p>
+    <w:p>
+      <w:pPr>
+        <w:spacing w:before="100" w:beforeAutospacing="1" w:line="240" w:lineRule="auto"/>
+        <w:jc w:val="both"/>
+        <w:rPr>
+          <w:rFonts w:ascii="Verdana" w:hAnsi="Verdana"/>
+        </w:rPr>
+      </w:pPr>
+      <w:r>
+        <w:rPr>
+          <w:rFonts w:ascii="Verdana" w:hAnsi="Verdana"/>
+        </w:rPr>
+        <w:t>1. Commit</w:t>
+      </w:r>
+    </w:p>
+    <w:p>
+      <w:pPr>
+        <w:spacing w:before="100" w:beforeAutospacing="1" w:line="240" w:lineRule="auto"/>
+        <w:jc w:val="both"/>
+        <w:rPr>
+          <w:rFonts w:ascii="Verdana" w:hAnsi="Verdana"/>
+        </w:rPr>
+      </w:pPr>
+      <w:r>
+        <w:rPr>
+          <w:rFonts w:ascii="Verdana" w:hAnsi="Verdana"/>
+        </w:rPr>
+        <w:t xml:space="preserve">2. </w:t>
+      </w:r>
+      <w:proofErr w:type="spellStart"/>
+      <w:r>
+        <w:rPr>
+          <w:rFonts w:ascii="Verdana" w:hAnsi="Verdana"/>
+        </w:rPr>
+        <w:t>Dockerfile</w:t>
+      </w:r>
+      <w:proofErr w:type="spellEnd"/>
+    </w:p>
+    <w:p>
+      <w:pPr>
+        <w:spacing w:before="100" w:beforeAutospacing="1" w:line="240" w:lineRule="auto"/>
+        <w:jc w:val="both"/>
+        <w:rPr>
+          <w:rFonts w:ascii="Verdana" w:hAnsi="Verdana"/>
+        </w:rPr>
+      </w:pPr>
+      <w:r>
+        <w:rPr>
+          <w:rFonts w:ascii="Verdana" w:hAnsi="Verdana"/>
+        </w:rPr>
+        <w:t>3. Compose</w:t>
+      </w:r>
+    </w:p>
+    <w:p>
+      <w:pPr>
+        <w:spacing w:before="100" w:beforeAutospacing="1" w:line="240" w:lineRule="auto"/>
+        <w:jc w:val="both"/>
+        <w:rPr>
+          <w:rFonts w:ascii="Verdana" w:hAnsi="Verdana"/>
+        </w:rPr>
+      </w:pPr>
+      <w:r>
+        <w:rPr>
+          <w:rFonts w:ascii="Verdana" w:hAnsi="Verdana"/>
+        </w:rPr>
+        <w:t xml:space="preserve">In </w:t>
+      </w:r>
+      <w:proofErr w:type="spellStart"/>
+      <w:r>
+        <w:rPr>
+          <w:rFonts w:ascii="Verdana" w:hAnsi="Verdana"/>
+        </w:rPr>
+        <w:t>Dockerfile</w:t>
+      </w:r>
+      <w:proofErr w:type="spellEnd"/>
+      <w:r>
+        <w:rPr>
+          <w:rFonts w:ascii="Verdana" w:hAnsi="Verdana"/>
+        </w:rPr>
+        <w:t>, you describe what you want to put in the image. Accordingly, you can create images that are used to run one or more containers, as shown in the image.</w:t>
+      </w:r>
+    </w:p>
+    <w:p>
+      <w:pPr>
+        <w:spacing w:before="100" w:beforeAutospacing="1" w:line="240" w:lineRule="auto"/>
+        <w:jc w:val="both"/>
+        <w:rPr>
+          <w:rFonts w:ascii="Verdana" w:hAnsi="Verdana"/>
+        </w:rPr>
+      </w:pPr>
+      <w:r>
+        <w:rPr>
+          <w:rFonts w:ascii="Verdana" w:hAnsi="Verdana"/>
+          <w:noProof/>
+        </w:rPr>
+        <w:lastRenderedPageBreak/>
+        <w:drawing>
+          <wp:inline distT="0" distB="0" distL="0" distR="0" wp14:anchorId="2A3384C4" wp14:editId="5008FD8D">
+            <wp:extent cx="5923588" cy="3332018"/>
+            <wp:effectExtent l="0" t="0" r="1270" b="1905"/>
+            <wp:docPr id="1446755665" name="Picture 4"/>
+            <wp:cNvGraphicFramePr>
+              <a:graphicFrameLocks xmlns:a="http://schemas.openxmlformats.org/drawingml/2006/main" noChangeAspect="1"/>
+            </wp:cNvGraphicFramePr>
+            <a:graphic xmlns:a="http://schemas.openxmlformats.org/drawingml/2006/main">
+              <a:graphicData uri="http://schemas.openxmlformats.org/drawingml/2006/picture">
+                <pic:pic xmlns:pic="http://schemas.openxmlformats.org/drawingml/2006/picture">
+                  <pic:nvPicPr>
+                    <pic:cNvPr id="0" name="Picture 4"/>
+                    <pic:cNvPicPr>
+                      <a:picLocks noChangeAspect="1" noChangeArrowheads="1"/>
+                    </pic:cNvPicPr>
+                  </pic:nvPicPr>
+                  <pic:blipFill>
+                    <a:blip r:embed="rId7">
+                      <a:extLst>
+                        <a:ext uri="{28A0092B-C50C-407E-A947-70E740481C1C}">
+                          <a14:useLocalDpi xmlns:a14="http://schemas.microsoft.com/office/drawing/2010/main" val="0"/>
+                        </a:ext>
+                      </a:extLst>
+                    </a:blip>
+                    <a:srcRect/>
+                    <a:stretch>
+                      <a:fillRect/>
+                    </a:stretch>
+                  </pic:blipFill>
+                  <pic:spPr bwMode="auto">
+                    <a:xfrm>
+                      <a:off x="0" y="0"/>
+                      <a:ext cx="5942178" cy="3342475"/>
+                    </a:xfrm>
+                    <a:prstGeom prst="rect">
+                      <a:avLst/>
+                    </a:prstGeom>
+                    <a:noFill/>
+                  </pic:spPr>
+                </pic:pic>
+              </a:graphicData>
+            </a:graphic>
+          </wp:inline>
+        </w:drawing>
+      </w:r>
+    </w:p>
+    <w:p>
+      <w:pPr>
+        <w:spacing w:before="100" w:beforeAutospacing="1" w:line="240" w:lineRule="auto"/>
+        <w:jc w:val="both"/>
+        <w:rPr>
+          <w:rFonts w:ascii="Verdana" w:hAnsi="Verdana"/>
+        </w:rPr>
+      </w:pPr>
+      <w:r>
+        <w:rPr>
+          <w:rFonts w:ascii="Verdana" w:hAnsi="Verdana"/>
+        </w:rPr>
+        <w:t>Here are the best practices for creating container images.</w:t>
+      </w:r>
+    </w:p>
+    <w:p>
+      <w:pPr>
+        <w:spacing w:before="100" w:beforeAutospacing="1" w:line="240" w:lineRule="auto"/>
+        <w:jc w:val="both"/>
+        <w:rPr>
+          <w:rFonts w:ascii="Verdana" w:hAnsi="Verdana"/>
+          <w:b/>
+          <w:bCs/>
+        </w:rPr>
+      </w:pPr>
+      <w:r>
+        <w:rPr>
+          <w:rFonts w:ascii="Verdana" w:hAnsi="Verdana"/>
+          <w:b/>
+          <w:bCs/>
+        </w:rPr>
+        <w:t>Keep container images smaller and simpler</w:t>
+      </w:r>
+    </w:p>
+    <w:p>
+      <w:pPr>
+        <w:spacing w:before="100" w:beforeAutospacing="1" w:line="240" w:lineRule="auto"/>
+        <w:jc w:val="both"/>
+        <w:rPr>
+          <w:rFonts w:ascii="Verdana" w:hAnsi="Verdana"/>
+        </w:rPr>
+      </w:pPr>
+      <w:r>
+        <w:rPr>
+          <w:rFonts w:ascii="Verdana" w:hAnsi="Verdana"/>
+        </w:rPr>
+        <w:t>Small images can quickly load into memory when starting services or containers and rapidly pull over the network. To keep the image size small, you should</w:t>
+      </w:r>
+    </w:p>
+    <w:p>
+      <w:pPr>
+        <w:spacing w:before="100" w:beforeAutospacing="1" w:line="240" w:lineRule="auto"/>
+        <w:jc w:val="both"/>
+        <w:rPr>
+          <w:rFonts w:ascii="Verdana" w:hAnsi="Verdana"/>
+        </w:rPr>
+      </w:pPr>
+      <w:r>
+        <w:rPr>
+          <w:rFonts w:ascii="Verdana" w:hAnsi="Verdana"/>
+        </w:rPr>
+        <w:t>Begin with an appropriate base image.</w:t>
+      </w:r>
+    </w:p>
+    <w:p>
+      <w:pPr>
+        <w:spacing w:before="100" w:beforeAutospacing="1" w:line="240" w:lineRule="auto"/>
+        <w:jc w:val="both"/>
+        <w:rPr>
+          <w:rFonts w:ascii="Verdana" w:hAnsi="Verdana"/>
+        </w:rPr>
+      </w:pPr>
+      <w:r>
+        <w:rPr>
+          <w:rFonts w:ascii="Verdana" w:hAnsi="Verdana"/>
+        </w:rPr>
+        <w:t xml:space="preserve">Use multistage builds so that your final image won’t include all the libraries and dependencies pulled in by the </w:t>
+      </w:r>
+      <w:proofErr w:type="gramStart"/>
+      <w:r>
+        <w:rPr>
+          <w:rFonts w:ascii="Verdana" w:hAnsi="Verdana"/>
+        </w:rPr>
+        <w:t>build</w:t>
+      </w:r>
+      <w:proofErr w:type="gramEnd"/>
+      <w:r>
+        <w:rPr>
+          <w:rFonts w:ascii="Verdana" w:hAnsi="Verdana"/>
+        </w:rPr>
+        <w:t xml:space="preserve"> but only the required artifacts and the environment.</w:t>
+      </w:r>
+    </w:p>
+    <w:p>
+      <w:pPr>
+        <w:spacing w:before="100" w:beforeAutospacing="1" w:line="240" w:lineRule="auto"/>
+        <w:jc w:val="both"/>
+        <w:rPr>
+          <w:rFonts w:ascii="Verdana" w:hAnsi="Verdana"/>
+        </w:rPr>
+      </w:pPr>
+      <w:r>
+        <w:rPr>
+          <w:rFonts w:ascii="Verdana" w:hAnsi="Verdana"/>
+        </w:rPr>
+        <w:t xml:space="preserve">A Docker image has reusable layers, i.e., different images might share some common layers. You can minimize the number of separate RUN commands in </w:t>
+      </w:r>
+      <w:proofErr w:type="spellStart"/>
+      <w:r>
+        <w:rPr>
+          <w:rFonts w:ascii="Verdana" w:hAnsi="Verdana"/>
+        </w:rPr>
+        <w:t>Dockerfile</w:t>
+      </w:r>
+      <w:proofErr w:type="spellEnd"/>
+      <w:r>
+        <w:rPr>
+          <w:rFonts w:ascii="Verdana" w:hAnsi="Verdana"/>
+        </w:rPr>
+        <w:t xml:space="preserve"> and decrease the number of layers in your image.</w:t>
+      </w:r>
+    </w:p>
+    <w:p>
+      <w:pPr>
+        <w:spacing w:before="100" w:beforeAutospacing="1" w:line="240" w:lineRule="auto"/>
+        <w:jc w:val="both"/>
+        <w:rPr>
+          <w:rFonts w:ascii="Verdana" w:hAnsi="Verdana"/>
+        </w:rPr>
+      </w:pPr>
+      <w:r>
+        <w:rPr>
+          <w:rFonts w:ascii="Verdana" w:hAnsi="Verdana"/>
+        </w:rPr>
+        <w:t>Importance: High</w:t>
+      </w:r>
+    </w:p>
+    <w:p>
+      <w:pPr>
+        <w:spacing w:before="100" w:beforeAutospacing="1" w:line="240" w:lineRule="auto"/>
+        <w:jc w:val="both"/>
+        <w:rPr>
+          <w:rFonts w:ascii="Verdana" w:hAnsi="Verdana"/>
+        </w:rPr>
+      </w:pPr>
+    </w:p>
+    <w:p>
+      <w:pPr>
+        <w:spacing w:before="100" w:beforeAutospacing="1" w:line="240" w:lineRule="auto"/>
+        <w:jc w:val="both"/>
+        <w:rPr>
+          <w:rFonts w:ascii="Verdana" w:hAnsi="Verdana"/>
+          <w:b/>
+          <w:bCs/>
+        </w:rPr>
+      </w:pPr>
+      <w:r>
+        <w:rPr>
+          <w:rFonts w:ascii="Verdana" w:hAnsi="Verdana"/>
+          <w:b/>
+          <w:bCs/>
+        </w:rPr>
+        <w:t>Smartly tag your images</w:t>
+      </w:r>
+    </w:p>
+    <w:p>
+      <w:pPr>
+        <w:spacing w:before="100" w:beforeAutospacing="1" w:line="240" w:lineRule="auto"/>
+        <w:jc w:val="both"/>
+        <w:rPr>
+          <w:rFonts w:ascii="Verdana" w:hAnsi="Verdana"/>
+        </w:rPr>
+      </w:pPr>
+      <w:r>
+        <w:rPr>
+          <w:rFonts w:ascii="Verdana" w:hAnsi="Verdana"/>
+        </w:rPr>
+        <w:lastRenderedPageBreak/>
+        <w:t>Docker tags convey essential information regarding a specific image version/variant, helping manage different versions of a Docker image. In addition, tags make it easy to pull and run images. There are two types of tags. Stable tags should be used for maintaining the base image, while unique tags must be used for container deployments.</w:t>
+      </w:r>
+    </w:p>
+    <w:p>
+      <w:pPr>
+        <w:spacing w:before="100" w:beforeAutospacing="1" w:line="240" w:lineRule="auto"/>
+        <w:jc w:val="both"/>
+        <w:rPr>
+          <w:rFonts w:ascii="Verdana" w:hAnsi="Verdana"/>
+        </w:rPr>
+      </w:pPr>
+      <w:r>
+        <w:rPr>
+          <w:rFonts w:ascii="Verdana" w:hAnsi="Verdana"/>
+        </w:rPr>
+        <w:t>Importance: High</w:t>
+      </w:r>
+    </w:p>
+    <w:p>
+      <w:pPr>
+        <w:spacing w:before="100" w:beforeAutospacing="1" w:line="240" w:lineRule="auto"/>
+        <w:jc w:val="both"/>
+        <w:rPr>
+          <w:rFonts w:ascii="Verdana" w:hAnsi="Verdana"/>
+        </w:rPr>
+      </w:pPr>
+    </w:p>
+    <w:p>
+      <w:pPr>
+        <w:spacing w:before="100" w:beforeAutospacing="1" w:line="240" w:lineRule="auto"/>
+        <w:jc w:val="both"/>
+        <w:rPr>
+          <w:rFonts w:ascii="Verdana" w:hAnsi="Verdana"/>
+          <w:b/>
+          <w:bCs/>
+        </w:rPr>
+      </w:pPr>
+      <w:r>
+        <w:rPr>
+          <w:rFonts w:ascii="Verdana" w:hAnsi="Verdana"/>
+          <w:b/>
+          <w:bCs/>
+        </w:rPr>
+        <w:t>Take advantage of Docker Registry or Hub</w:t>
+      </w:r>
+    </w:p>
+    <w:p>
+      <w:pPr>
+        <w:spacing w:before="100" w:beforeAutospacing="1" w:line="240" w:lineRule="auto"/>
+        <w:jc w:val="both"/>
+        <w:rPr>
+          <w:rFonts w:ascii="Verdana" w:hAnsi="Verdana"/>
+        </w:rPr>
+      </w:pPr>
+      <w:r>
+        <w:rPr>
+          <w:rFonts w:ascii="Verdana" w:hAnsi="Verdana"/>
+        </w:rPr>
+        <w:t>Docker Registry is a highly scalable server-side application for the storage and distribution of Docker images. It allows users to pull images locally and store new ones in the registry. With the container registry, you can:</w:t>
+      </w:r>
+    </w:p>
+    <w:p>
+      <w:pPr>
+        <w:spacing w:before="100" w:beforeAutospacing="1" w:line="240" w:lineRule="auto"/>
+        <w:jc w:val="both"/>
+        <w:rPr>
+          <w:rFonts w:ascii="Verdana" w:hAnsi="Verdana"/>
+        </w:rPr>
+      </w:pPr>
+      <w:r>
+        <w:rPr>
+          <w:rFonts w:ascii="Verdana" w:hAnsi="Verdana"/>
+        </w:rPr>
+        <w:t>Firmly control your images’ storage location</w:t>
+      </w:r>
+    </w:p>
+    <w:p>
+      <w:pPr>
+        <w:spacing w:before="100" w:beforeAutospacing="1" w:line="240" w:lineRule="auto"/>
+        <w:jc w:val="both"/>
+        <w:rPr>
+          <w:rFonts w:ascii="Verdana" w:hAnsi="Verdana"/>
+        </w:rPr>
+      </w:pPr>
+      <w:r>
+        <w:rPr>
+          <w:rFonts w:ascii="Verdana" w:hAnsi="Verdana"/>
+        </w:rPr>
+        <w:t>Completely own your images’ distribution pipeline</w:t>
+      </w:r>
+    </w:p>
+    <w:p>
+      <w:pPr>
+        <w:spacing w:before="100" w:beforeAutospacing="1" w:line="240" w:lineRule="auto"/>
+        <w:jc w:val="both"/>
+        <w:rPr>
+          <w:rFonts w:ascii="Verdana" w:hAnsi="Verdana"/>
+        </w:rPr>
+      </w:pPr>
+      <w:r>
+        <w:rPr>
+          <w:rFonts w:ascii="Verdana" w:hAnsi="Verdana"/>
+        </w:rPr>
+        <w:t>Integrate image storage and distribution soundly into your in-house development workflow</w:t>
+      </w:r>
+    </w:p>
+    <w:p>
+      <w:pPr>
+        <w:spacing w:before="100" w:beforeAutospacing="1" w:line="240" w:lineRule="auto"/>
+        <w:jc w:val="both"/>
+        <w:rPr>
+          <w:rFonts w:ascii="Verdana" w:hAnsi="Verdana"/>
+        </w:rPr>
+      </w:pPr>
+      <w:r>
+        <w:rPr>
+          <w:rFonts w:ascii="Verdana" w:hAnsi="Verdana"/>
+        </w:rPr>
+        <w:t>A Docker registry is organized into Docker repositories, which hold all the versions of a specific image. At the same time, Docker Hub provides a free hosted Registry with additional features for organization accounts, automated builds, etc.</w:t>
+      </w:r>
+    </w:p>
+    <w:p>
+      <w:pPr>
+        <w:spacing w:before="100" w:beforeAutospacing="1" w:line="240" w:lineRule="auto"/>
+        <w:jc w:val="both"/>
+        <w:rPr>
+          <w:rFonts w:ascii="Verdana" w:hAnsi="Verdana"/>
+        </w:rPr>
+      </w:pPr>
+      <w:r>
+        <w:rPr>
+          <w:rFonts w:ascii="Verdana" w:hAnsi="Verdana"/>
+        </w:rPr>
+        <w:t>Importance: Medium</w:t>
+      </w:r>
+    </w:p>
+    <w:p>
+      <w:pPr>
+        <w:spacing w:before="100" w:beforeAutospacing="1" w:line="240" w:lineRule="auto"/>
+        <w:jc w:val="both"/>
+        <w:rPr>
+          <w:rFonts w:ascii="Verdana" w:hAnsi="Verdana"/>
+        </w:rPr>
+      </w:pPr>
+      <w:r>
+        <w:rPr>
+          <w:rFonts w:ascii="Verdana" w:hAnsi="Verdana"/>
+        </w:rPr>
+        <w:t xml:space="preserve">5.5 </w:t>
+      </w:r>
+      <w:r>
+        <w:rPr>
+          <w:rFonts w:ascii="Verdana" w:hAnsi="Verdana"/>
+        </w:rPr>
+        <w:t>Containerization best practices for operating containers</w:t>
+      </w:r>
+    </w:p>
+    <w:p>
+      <w:pPr>
+        <w:spacing w:before="100" w:beforeAutospacing="1" w:line="240" w:lineRule="auto"/>
+        <w:jc w:val="both"/>
+        <w:rPr>
+          <w:rFonts w:ascii="Verdana" w:hAnsi="Verdana"/>
+        </w:rPr>
+      </w:pPr>
+      <w:r>
+        <w:rPr>
+          <w:rFonts w:ascii="Verdana" w:hAnsi="Verdana"/>
+        </w:rPr>
+        <w:t>Containers create unique challenges: the tradeoffs for the high degree of agility and scalability that containers enable. Here are the best practices that help resolve several challenges that may arise while operating containers.</w:t>
+      </w:r>
+    </w:p>
+    <w:p>
+      <w:pPr>
+        <w:spacing w:before="100" w:beforeAutospacing="1" w:line="240" w:lineRule="auto"/>
+        <w:jc w:val="both"/>
+        <w:rPr>
+          <w:rFonts w:ascii="Verdana" w:hAnsi="Verdana"/>
+        </w:rPr>
+      </w:pPr>
+      <w:r>
+        <w:rPr>
+          <w:rFonts w:ascii="Verdana" w:hAnsi="Verdana"/>
+        </w:rPr>
+        <w:t>Use persistent data storage</w:t>
+      </w:r>
+    </w:p>
+    <w:p>
+      <w:pPr>
+        <w:spacing w:before="100" w:beforeAutospacing="1" w:line="240" w:lineRule="auto"/>
+        <w:jc w:val="both"/>
+        <w:rPr>
+          <w:rFonts w:ascii="Verdana" w:hAnsi="Verdana"/>
+        </w:rPr>
+      </w:pPr>
+      <w:r>
+        <w:rPr>
+          <w:rFonts w:ascii="Verdana" w:hAnsi="Verdana"/>
+        </w:rPr>
+        <w:t xml:space="preserve">Persistent, or often referred to as nonvolatile storage, pertains to databases—that remain available beyond the life of individual containers. Storing data within a container’s storage layer will result in the container growing exponentially and the unavailability of data when the container goes down. Instead, by storing your data in persistent volumes, you can ensure the size </w:t>
+      </w:r>
+      <w:r>
+        <w:rPr>
+          <w:rFonts w:ascii="Verdana" w:hAnsi="Verdana"/>
+        </w:rPr>
+        <w:lastRenderedPageBreak/>
+        <w:t>of the containers won’t grow with more data, and the stored data can be accessible by various containers.</w:t>
+      </w:r>
+    </w:p>
+    <w:p>
+      <w:pPr>
+        <w:spacing w:before="100" w:beforeAutospacing="1" w:line="240" w:lineRule="auto"/>
+        <w:jc w:val="both"/>
+        <w:rPr>
+          <w:rFonts w:ascii="Verdana" w:hAnsi="Verdana"/>
+        </w:rPr>
+      </w:pPr>
+      <w:r>
+        <w:rPr>
+          <w:rFonts w:ascii="Verdana" w:hAnsi="Verdana"/>
+        </w:rPr>
+        <w:t>Importance: High</w:t>
+      </w:r>
+    </w:p>
+    <w:p>
+      <w:pPr>
+        <w:spacing w:before="100" w:beforeAutospacing="1" w:line="240" w:lineRule="auto"/>
+        <w:jc w:val="both"/>
+        <w:rPr>
+          <w:rFonts w:ascii="Verdana" w:hAnsi="Verdana"/>
+        </w:rPr>
+      </w:pPr>
+      <w:r>
+        <w:rPr>
+          <w:rFonts w:ascii="Verdana" w:hAnsi="Verdana"/>
+          <w:noProof/>
+        </w:rPr>
+        <w:drawing>
+          <wp:inline distT="0" distB="0" distL="0" distR="0" wp14:anchorId="4C8A0C08" wp14:editId="245BDF48">
+            <wp:extent cx="5895109" cy="2617490"/>
+            <wp:effectExtent l="0" t="0" r="0" b="0"/>
+            <wp:docPr id="2049447230" name="Picture 5"/>
+            <wp:cNvGraphicFramePr>
+              <a:graphicFrameLocks xmlns:a="http://schemas.openxmlformats.org/drawingml/2006/main" noChangeAspect="1"/>
+            </wp:cNvGraphicFramePr>
+            <a:graphic xmlns:a="http://schemas.openxmlformats.org/drawingml/2006/main">
+              <a:graphicData uri="http://schemas.openxmlformats.org/drawingml/2006/picture">
+                <pic:pic xmlns:pic="http://schemas.openxmlformats.org/drawingml/2006/picture">
+                  <pic:nvPicPr>
+                    <pic:cNvPr id="0" name="Picture 5"/>
+                    <pic:cNvPicPr>
+                      <a:picLocks noChangeAspect="1" noChangeArrowheads="1"/>
+                    </pic:cNvPicPr>
+                  </pic:nvPicPr>
+                  <pic:blipFill>
+                    <a:blip r:embed="rId8">
+                      <a:extLst>
+                        <a:ext uri="{28A0092B-C50C-407E-A947-70E740481C1C}">
+                          <a14:useLocalDpi xmlns:a14="http://schemas.microsoft.com/office/drawing/2010/main" val="0"/>
+                        </a:ext>
+                      </a:extLst>
+                    </a:blip>
+                    <a:srcRect/>
+                    <a:stretch>
+                      <a:fillRect/>
+                    </a:stretch>
+                  </pic:blipFill>
+                  <pic:spPr bwMode="auto">
+                    <a:xfrm>
+                      <a:off x="0" y="0"/>
+                      <a:ext cx="5913242" cy="2625541"/>
+                    </a:xfrm>
+                    <a:prstGeom prst="rect">
+                      <a:avLst/>
+                    </a:prstGeom>
+                    <a:noFill/>
+                  </pic:spPr>
+                </pic:pic>
+              </a:graphicData>
+            </a:graphic>
+          </wp:inline>
+        </w:drawing>
+      </w:r>
+    </w:p>
+    <w:p>
+      <w:pPr>
+        <w:spacing w:before="100" w:beforeAutospacing="1" w:line="240" w:lineRule="auto"/>
+        <w:jc w:val="both"/>
+        <w:rPr>
+          <w:rFonts w:ascii="Verdana" w:hAnsi="Verdana"/>
+        </w:rPr>
+      </w:pPr>
+    </w:p>
+    <w:p>
+      <w:pPr>
+        <w:spacing w:before="100" w:beforeAutospacing="1" w:line="240" w:lineRule="auto"/>
+        <w:jc w:val="both"/>
+        <w:rPr>
+          <w:rFonts w:ascii="Verdana" w:hAnsi="Verdana"/>
+          <w:b/>
+          <w:bCs/>
+        </w:rPr>
+      </w:pPr>
+      <w:r>
+        <w:rPr>
+          <w:rFonts w:ascii="Verdana" w:hAnsi="Verdana"/>
+          <w:b/>
+          <w:bCs/>
+        </w:rPr>
+        <w:t>Employing</w:t>
+      </w:r>
+      <w:r>
+        <w:rPr>
+          <w:rFonts w:ascii="Verdana" w:hAnsi="Verdana"/>
+          <w:b/>
+          <w:bCs/>
+        </w:rPr>
+        <w:t xml:space="preserve"> CI/CD</w:t>
+      </w:r>
+    </w:p>
+    <w:p>
+      <w:pPr>
+        <w:spacing w:before="100" w:beforeAutospacing="1" w:line="240" w:lineRule="auto"/>
+        <w:jc w:val="both"/>
+        <w:rPr>
+          <w:rFonts w:ascii="Verdana" w:hAnsi="Verdana"/>
+        </w:rPr>
+      </w:pPr>
+      <w:r>
+        <w:rPr>
+          <w:rFonts w:ascii="Verdana" w:hAnsi="Verdana"/>
+        </w:rPr>
+        <w:t>Continuous integration/continuous delivery is an essential DevOps practice that has entirely revamped traditional application development. Likewise, containerization and CI/CD combined can bring even more flexibility and benefits to the entire process. Adopting the continuous integration/continuous deployment (CI/CD) approach frees you from manual testing and redeploying everything.</w:t>
+      </w:r>
+    </w:p>
+    <w:p>
+      <w:pPr>
+        <w:spacing w:before="100" w:beforeAutospacing="1" w:line="240" w:lineRule="auto"/>
+        <w:jc w:val="both"/>
+        <w:rPr>
+          <w:rFonts w:ascii="Verdana" w:hAnsi="Verdana"/>
+        </w:rPr>
+      </w:pPr>
+      <w:r>
+        <w:rPr>
+          <w:rFonts w:ascii="Verdana" w:hAnsi="Verdana"/>
+        </w:rPr>
+        <w:t>Importance: High</w:t>
+      </w:r>
+    </w:p>
+    <w:p>
+      <w:pPr>
+        <w:spacing w:before="100" w:beforeAutospacing="1" w:line="240" w:lineRule="auto"/>
+        <w:jc w:val="both"/>
+        <w:rPr>
+          <w:rFonts w:ascii="Verdana" w:hAnsi="Verdana"/>
+        </w:rPr>
+      </w:pPr>
+    </w:p>
+    <w:p>
+      <w:pPr>
+        <w:spacing w:before="100" w:beforeAutospacing="1" w:line="240" w:lineRule="auto"/>
+        <w:jc w:val="both"/>
+        <w:rPr>
+          <w:rFonts w:ascii="Verdana" w:hAnsi="Verdana"/>
+          <w:b/>
+          <w:bCs/>
+        </w:rPr>
+      </w:pPr>
+      <w:r>
+        <w:rPr>
+          <w:rFonts w:ascii="Verdana" w:hAnsi="Verdana"/>
+          <w:b/>
+          <w:bCs/>
+        </w:rPr>
+        <w:t>Empower with container orchestration tools</w:t>
+      </w:r>
+    </w:p>
+    <w:p>
+      <w:pPr>
+        <w:spacing w:before="100" w:beforeAutospacing="1" w:line="240" w:lineRule="auto"/>
+        <w:jc w:val="both"/>
+        <w:rPr>
+          <w:rFonts w:ascii="Verdana" w:hAnsi="Verdana"/>
+        </w:rPr>
+      </w:pPr>
+      <w:r>
+        <w:rPr>
+          <w:rFonts w:ascii="Verdana" w:hAnsi="Verdana"/>
+        </w:rPr>
+        <w:t>The complexity introduced by containers can quickly become uncontrollable without container orchestration to manage it. Container orchestration tools can boost resilience by automatically restarting or scaling a container or cluster. Automation is a critical characteristic of virtually every aspect of building a containerized application that you want to orchestrate. Container orchestration automates the scheduling, deployment, scaling, networking, health monitoring, and management of containers.</w:t>
+      </w:r>
+    </w:p>
+    <w:p>
+      <w:pPr>
+        <w:spacing w:before="100" w:beforeAutospacing="1" w:line="240" w:lineRule="auto"/>
+        <w:jc w:val="both"/>
+        <w:rPr>
+          <w:rFonts w:ascii="Verdana" w:hAnsi="Verdana"/>
+        </w:rPr>
+      </w:pPr>
+      <w:r>
+        <w:rPr>
+          <w:rFonts w:ascii="Verdana" w:hAnsi="Verdana"/>
+        </w:rPr>
+        <w:lastRenderedPageBreak/>
+        <w:t>Importance: High</w:t>
+      </w:r>
+    </w:p>
+    <w:p>
+      <w:pPr>
+        <w:spacing w:before="100" w:beforeAutospacing="1" w:line="240" w:lineRule="auto"/>
+        <w:jc w:val="both"/>
+        <w:rPr>
+          <w:rFonts w:ascii="Verdana" w:hAnsi="Verdana"/>
+        </w:rPr>
+      </w:pPr>
+    </w:p>
+    <w:p>
+      <w:pPr>
+        <w:spacing w:before="100" w:beforeAutospacing="1" w:line="240" w:lineRule="auto"/>
+        <w:jc w:val="both"/>
+        <w:rPr>
+          <w:rFonts w:ascii="Verdana" w:hAnsi="Verdana"/>
+        </w:rPr>
+      </w:pPr>
+      <w:r>
+        <w:rPr>
+          <w:rFonts w:ascii="Verdana" w:hAnsi="Verdana"/>
+        </w:rPr>
+        <w:t xml:space="preserve">5.6 </w:t>
+      </w:r>
+      <w:r>
+        <w:rPr>
+          <w:rFonts w:ascii="Verdana" w:hAnsi="Verdana"/>
+        </w:rPr>
+        <w:t>Containerization best practices for ensuring container security</w:t>
+      </w:r>
+    </w:p>
+    <w:p>
+      <w:pPr>
+        <w:spacing w:before="100" w:beforeAutospacing="1" w:line="240" w:lineRule="auto"/>
+        <w:jc w:val="both"/>
+        <w:rPr>
+          <w:rFonts w:ascii="Verdana" w:hAnsi="Verdana"/>
+        </w:rPr>
+      </w:pPr>
+      <w:r>
+        <w:rPr>
+          <w:rFonts w:ascii="Verdana" w:hAnsi="Verdana"/>
+        </w:rPr>
+        <w:t xml:space="preserve">Traditional vulnerability management approaches fall short in securing containers. Container invisibility, its immutable nature, and compromised open-source building blocks make the matter worse. An exploitable vulnerability of a container, combined with a wrong </w:t>
+      </w:r>
+      <w:proofErr w:type="gramStart"/>
+      <w:r>
+        <w:rPr>
+          <w:rFonts w:ascii="Verdana" w:hAnsi="Verdana"/>
+        </w:rPr>
+        <w:t>credentials</w:t>
+      </w:r>
+      <w:proofErr w:type="gramEnd"/>
+      <w:r>
+        <w:rPr>
+          <w:rFonts w:ascii="Verdana" w:hAnsi="Verdana"/>
+        </w:rPr>
+        <w:t xml:space="preserve"> configuration and exposed metadata, can compromise the entire cloud infrastructure.</w:t>
+      </w:r>
+    </w:p>
+    <w:p>
+      <w:pPr>
+        <w:spacing w:before="100" w:beforeAutospacing="1" w:line="240" w:lineRule="auto"/>
+        <w:jc w:val="both"/>
+        <w:rPr>
+          <w:rFonts w:ascii="Verdana" w:hAnsi="Verdana"/>
+        </w:rPr>
+      </w:pPr>
+    </w:p>
+    <w:p>
+      <w:pPr>
+        <w:spacing w:before="100" w:beforeAutospacing="1" w:line="240" w:lineRule="auto"/>
+        <w:jc w:val="both"/>
+        <w:rPr>
+          <w:rFonts w:ascii="Verdana" w:hAnsi="Verdana"/>
+        </w:rPr>
+      </w:pPr>
+      <w:r>
+        <w:rPr>
+          <w:rFonts w:ascii="Verdana" w:hAnsi="Verdana"/>
+        </w:rPr>
+        <w:t>Container Security Best Practices</w:t>
+      </w:r>
+    </w:p>
+    <w:p>
+      <w:pPr>
+        <w:spacing w:before="100" w:beforeAutospacing="1" w:line="240" w:lineRule="auto"/>
+        <w:jc w:val="both"/>
+        <w:rPr>
+          <w:rFonts w:ascii="Verdana" w:hAnsi="Verdana"/>
+        </w:rPr>
+      </w:pPr>
+      <w:r>
+        <w:rPr>
+          <w:rFonts w:ascii="Verdana" w:hAnsi="Verdana"/>
+        </w:rPr>
+        <w:t>Here are the best container security practices that you should follow.</w:t>
+      </w:r>
+    </w:p>
+    <w:p>
+      <w:pPr>
+        <w:spacing w:before="100" w:beforeAutospacing="1" w:line="240" w:lineRule="auto"/>
+        <w:jc w:val="both"/>
+        <w:rPr>
+          <w:rFonts w:ascii="Verdana" w:hAnsi="Verdana"/>
+          <w:b/>
+          <w:bCs/>
+        </w:rPr>
+      </w:pPr>
+      <w:r>
+        <w:rPr>
+          <w:rFonts w:ascii="Verdana" w:hAnsi="Verdana"/>
+          <w:b/>
+          <w:bCs/>
+        </w:rPr>
+        <w:t>Protect container runtime</w:t>
+      </w:r>
+    </w:p>
+    <w:p>
+      <w:pPr>
+        <w:spacing w:before="100" w:beforeAutospacing="1" w:line="240" w:lineRule="auto"/>
+        <w:jc w:val="both"/>
+        <w:rPr>
+          <w:rFonts w:ascii="Verdana" w:hAnsi="Verdana"/>
+        </w:rPr>
+      </w:pPr>
+      <w:r>
+        <w:rPr>
+          <w:rFonts w:ascii="Verdana" w:hAnsi="Verdana"/>
+        </w:rPr>
+        <w:t xml:space="preserve">A container runtime can be </w:t>
+      </w:r>
+      <w:proofErr w:type="gramStart"/>
+      <w:r>
+        <w:rPr>
+          <w:rFonts w:ascii="Verdana" w:hAnsi="Verdana"/>
+        </w:rPr>
+        <w:t>pretty challenging</w:t>
+      </w:r>
+      <w:proofErr w:type="gramEnd"/>
+      <w:r>
+        <w:rPr>
+          <w:rFonts w:ascii="Verdana" w:hAnsi="Verdana"/>
+        </w:rPr>
+        <w:t xml:space="preserve"> to secure. By scanning container runtime, you can know which container images are running in production </w:t>
+      </w:r>
+      <w:proofErr w:type="gramStart"/>
+      <w:r>
+        <w:rPr>
+          <w:rFonts w:ascii="Verdana" w:hAnsi="Verdana"/>
+        </w:rPr>
+        <w:t>and also</w:t>
+      </w:r>
+      <w:proofErr w:type="gramEnd"/>
+      <w:r>
+        <w:rPr>
+          <w:rFonts w:ascii="Verdana" w:hAnsi="Verdana"/>
+        </w:rPr>
+        <w:t xml:space="preserve"> view essential container information about image changes, metadata, and runtime vulnerabilities. It’s better to establish behavioral baselines for the container environment in a standard and secure state. This helps detect and prevent potential attacks and anomalies.</w:t>
+      </w:r>
+    </w:p>
+    <w:p>
+      <w:pPr>
+        <w:spacing w:before="100" w:beforeAutospacing="1" w:line="240" w:lineRule="auto"/>
+        <w:jc w:val="both"/>
+        <w:rPr>
+          <w:rFonts w:ascii="Verdana" w:hAnsi="Verdana"/>
+        </w:rPr>
+      </w:pPr>
+      <w:r>
+        <w:rPr>
+          <w:rFonts w:ascii="Verdana" w:hAnsi="Verdana"/>
+        </w:rPr>
+        <w:t>Importance: High</w:t>
+      </w:r>
+    </w:p>
+    <w:p>
+      <w:pPr>
+        <w:spacing w:before="100" w:beforeAutospacing="1" w:line="240" w:lineRule="auto"/>
+        <w:jc w:val="both"/>
+        <w:rPr>
+          <w:rFonts w:ascii="Verdana" w:hAnsi="Verdana"/>
+        </w:rPr>
+      </w:pPr>
+    </w:p>
+    <w:p>
+      <w:pPr>
+        <w:spacing w:before="100" w:beforeAutospacing="1" w:line="240" w:lineRule="auto"/>
+        <w:jc w:val="both"/>
+        <w:rPr>
+          <w:rFonts w:ascii="Verdana" w:hAnsi="Verdana"/>
+          <w:b/>
+          <w:bCs/>
+        </w:rPr>
+      </w:pPr>
+      <w:r>
+        <w:rPr>
+          <w:rFonts w:ascii="Verdana" w:hAnsi="Verdana"/>
+          <w:b/>
+          <w:bCs/>
+        </w:rPr>
+        <w:t>Shift processes “to the left”</w:t>
+      </w:r>
+    </w:p>
+    <w:p>
+      <w:pPr>
+        <w:spacing w:before="100" w:beforeAutospacing="1" w:line="240" w:lineRule="auto"/>
+        <w:jc w:val="both"/>
+        <w:rPr>
+          <w:rFonts w:ascii="Verdana" w:hAnsi="Verdana"/>
+        </w:rPr>
+      </w:pPr>
+      <w:r>
+        <w:rPr>
+          <w:rFonts w:ascii="Verdana" w:hAnsi="Verdana"/>
+        </w:rPr>
+        <w:t xml:space="preserve">Shifting left is a key DevOps principle that allows you to </w:t>
+      </w:r>
+      <w:proofErr w:type="gramStart"/>
+      <w:r>
+        <w:rPr>
+          <w:rFonts w:ascii="Verdana" w:hAnsi="Verdana"/>
+        </w:rPr>
+        <w:t>test for</w:t>
+      </w:r>
+      <w:proofErr w:type="gramEnd"/>
+      <w:r>
+        <w:rPr>
+          <w:rFonts w:ascii="Verdana" w:hAnsi="Verdana"/>
+        </w:rPr>
+        <w:t xml:space="preserve"> vulnerabilities in the early stages of software development. However, the shift-left mentality can also be applied to security, and it is best performed by starting early in the delivery pipeline. Containers can play a critical role in facilitating this approach by providing environment parity at every stage of the delivery pipeline, taking the operating system and many environment variables out of the picture, and enabling flexible timing for software delivery processes.</w:t>
+      </w:r>
+    </w:p>
+    <w:p>
+      <w:pPr>
+        <w:spacing w:before="100" w:beforeAutospacing="1" w:line="240" w:lineRule="auto"/>
+        <w:jc w:val="both"/>
+        <w:rPr>
+          <w:rFonts w:ascii="Verdana" w:hAnsi="Verdana"/>
+        </w:rPr>
+      </w:pPr>
+      <w:r>
+        <w:rPr>
+          <w:rFonts w:ascii="Verdana" w:hAnsi="Verdana"/>
+        </w:rPr>
+        <w:t>Importance: Medium</w:t>
+      </w:r>
+    </w:p>
+    <w:p>
+      <w:pPr>
+        <w:spacing w:before="100" w:beforeAutospacing="1" w:line="240" w:lineRule="auto"/>
+        <w:jc w:val="both"/>
+        <w:rPr>
+          <w:rFonts w:ascii="Verdana" w:hAnsi="Verdana"/>
+        </w:rPr>
+      </w:pPr>
+    </w:p>
+    <w:p>
+      <w:pPr>
+        <w:spacing w:before="100" w:beforeAutospacing="1" w:line="240" w:lineRule="auto"/>
+        <w:jc w:val="both"/>
+        <w:rPr>
+          <w:rFonts w:ascii="Verdana" w:hAnsi="Verdana"/>
+          <w:b/>
+          <w:bCs/>
+        </w:rPr>
+      </w:pPr>
+      <w:r>
+        <w:rPr>
+          <w:rFonts w:ascii="Verdana" w:hAnsi="Verdana"/>
+          <w:b/>
+          <w:bCs/>
+        </w:rPr>
+        <w:lastRenderedPageBreak/>
+        <w:t>Create container security policies</w:t>
+      </w:r>
+    </w:p>
+    <w:p>
+      <w:pPr>
+        <w:spacing w:before="100" w:beforeAutospacing="1" w:line="240" w:lineRule="auto"/>
+        <w:jc w:val="both"/>
+        <w:rPr>
+          <w:rFonts w:ascii="Verdana" w:hAnsi="Verdana"/>
+        </w:rPr>
+      </w:pPr>
+      <w:r>
+        <w:rPr>
+          <w:rFonts w:ascii="Verdana" w:hAnsi="Verdana"/>
+        </w:rPr>
+        <w:t>Establish container security policies for different phases of the container lifecycle based on the presence of malware and overall risk scores. These policies should align with business objectives and goals. Also, developers should be instantly notified with layer-specific details when a particular container image exceeds the risk threshold so that they can take direct action for rectification. Policy violations can also trigger alert notifications to block specific images from being deployed as per the organization’s preferences.</w:t>
+      </w:r>
+    </w:p>
+    <w:p>
+      <w:pPr>
+        <w:spacing w:before="100" w:beforeAutospacing="1" w:line="240" w:lineRule="auto"/>
+        <w:jc w:val="both"/>
+        <w:rPr>
+          <w:rFonts w:ascii="Verdana" w:hAnsi="Verdana"/>
+        </w:rPr>
+      </w:pPr>
+      <w:r>
+        <w:rPr>
+          <w:rFonts w:ascii="Verdana" w:hAnsi="Verdana"/>
+        </w:rPr>
+        <w:t>You should also use tools and implement security practices to observe container engines, master nodes, and containerized middleware and networking.</w:t>
+      </w:r>
+    </w:p>
+    <w:p>
+      <w:pPr>
+        <w:spacing w:before="100" w:beforeAutospacing="1" w:line="240" w:lineRule="auto"/>
+        <w:jc w:val="both"/>
+        <w:rPr>
+          <w:rFonts w:ascii="Verdana" w:hAnsi="Verdana"/>
+        </w:rPr>
+      </w:pPr>
+      <w:r>
+        <w:rPr>
+          <w:rFonts w:ascii="Verdana" w:hAnsi="Verdana"/>
+        </w:rPr>
+        <w:t>Importance: High</w:t>
+      </w:r>
+    </w:p>
+    <w:p>
+      <w:pPr>
+        <w:spacing w:before="100" w:beforeAutospacing="1" w:line="240" w:lineRule="auto"/>
+        <w:jc w:val="both"/>
+        <w:rPr>
+          <w:rFonts w:ascii="Verdana" w:hAnsi="Verdana"/>
+        </w:rPr>
+      </w:pPr>
+    </w:p>
+    <w:p>
+      <w:pPr>
+        <w:spacing w:before="100" w:beforeAutospacing="1" w:line="240" w:lineRule="auto"/>
+        <w:jc w:val="both"/>
+        <w:rPr>
+          <w:rFonts w:ascii="Verdana" w:hAnsi="Verdana"/>
+        </w:rPr>
+      </w:pPr>
+      <w:r>
+        <w:rPr>
+          <w:rFonts w:ascii="Verdana" w:hAnsi="Verdana"/>
+        </w:rPr>
+        <w:t>In addition to the practices mentioned above, you should</w:t>
+      </w:r>
+    </w:p>
+    <w:p>
+      <w:pPr>
+        <w:pStyle w:val="ListParagraph"/>
+        <w:numPr>
+          <w:ilvl w:val="0"/>
+          <w:numId w:val="46"/>
+        </w:numPr>
+        <w:spacing w:before="100" w:beforeAutospacing="1" w:line="240" w:lineRule="auto"/>
+        <w:jc w:val="both"/>
+        <w:rPr>
+          <w:rFonts w:ascii="Verdana" w:hAnsi="Verdana"/>
+        </w:rPr>
+      </w:pPr>
+      <w:r>
+        <w:rPr>
+          <w:rFonts w:ascii="Verdana" w:hAnsi="Verdana"/>
+        </w:rPr>
+        <w:t xml:space="preserve">Scan container images for </w:t>
+      </w:r>
+      <w:r>
+        <w:rPr>
+          <w:rFonts w:ascii="Verdana" w:hAnsi="Verdana"/>
+        </w:rPr>
+        <w:t>vulnerability</w:t>
+      </w:r>
+      <w:r>
+        <w:rPr>
+          <w:rFonts w:ascii="Verdana" w:hAnsi="Verdana"/>
+        </w:rPr>
+        <w:t>.</w:t>
+      </w:r>
+    </w:p>
+    <w:p>
+      <w:pPr>
+        <w:pStyle w:val="ListParagraph"/>
+        <w:numPr>
+          <w:ilvl w:val="0"/>
+          <w:numId w:val="46"/>
+        </w:numPr>
+        <w:spacing w:before="100" w:beforeAutospacing="1" w:line="240" w:lineRule="auto"/>
+        <w:jc w:val="both"/>
+        <w:rPr>
+          <w:rFonts w:ascii="Verdana" w:hAnsi="Verdana"/>
+        </w:rPr>
+      </w:pPr>
+      <w:r>
+        <w:rPr>
+          <w:rFonts w:ascii="Verdana" w:hAnsi="Verdana"/>
+        </w:rPr>
+        <w:t xml:space="preserve">Take advantage of </w:t>
+      </w:r>
+      <w:r>
+        <w:rPr>
+          <w:rFonts w:ascii="Verdana" w:hAnsi="Verdana"/>
+        </w:rPr>
+        <w:t>industry’s</w:t>
+      </w:r>
+      <w:r>
+        <w:rPr>
+          <w:rFonts w:ascii="Verdana" w:hAnsi="Verdana"/>
+        </w:rPr>
+        <w:t xml:space="preserve"> best practices, like the CIS Docker Benchmark and CIS Kubernetes benchmark, which address configuration, permissions, access, patching, and sprawl.</w:t>
+      </w:r>
+    </w:p>
+    <w:p>
+      <w:pPr>
+        <w:pStyle w:val="ListParagraph"/>
+        <w:numPr>
+          <w:ilvl w:val="0"/>
+          <w:numId w:val="46"/>
+        </w:numPr>
+        <w:spacing w:before="100" w:beforeAutospacing="1" w:line="240" w:lineRule="auto"/>
+        <w:jc w:val="both"/>
+        <w:rPr>
+          <w:rFonts w:ascii="Verdana" w:hAnsi="Verdana"/>
+        </w:rPr>
+      </w:pPr>
+      <w:r>
+        <w:rPr>
+          <w:rFonts w:ascii="Verdana" w:hAnsi="Verdana"/>
+        </w:rPr>
+        <w:t>Use thoroughly documented APIs from Jenkins, Bamboo, and Travis CI to integrate security testing within your CI/CD build systems.</w:t>
+      </w:r>
+    </w:p>
+    <w:p>
+      <w:pPr>
+        <w:pStyle w:val="ListParagraph"/>
+        <w:numPr>
+          <w:ilvl w:val="0"/>
+          <w:numId w:val="46"/>
+        </w:numPr>
+        <w:spacing w:before="100" w:beforeAutospacing="1" w:line="240" w:lineRule="auto"/>
+        <w:jc w:val="both"/>
+        <w:rPr>
+          <w:rFonts w:ascii="Verdana" w:hAnsi="Verdana"/>
+        </w:rPr>
+      </w:pPr>
+      <w:r>
+        <w:rPr>
+          <w:rFonts w:ascii="Verdana" w:hAnsi="Verdana"/>
+        </w:rPr>
+        <w:t xml:space="preserve">Import and connect to container image registries like Docker Trusted Registry, Amazon ECR, and </w:t>
+      </w:r>
+      <w:proofErr w:type="spellStart"/>
+      <w:r>
+        <w:rPr>
+          <w:rFonts w:ascii="Verdana" w:hAnsi="Verdana"/>
+        </w:rPr>
+        <w:t>JFrog</w:t>
+      </w:r>
+      <w:proofErr w:type="spellEnd"/>
+      <w:r>
+        <w:rPr>
+          <w:rFonts w:ascii="Verdana" w:hAnsi="Verdana"/>
+        </w:rPr>
+        <w:t xml:space="preserve"> Artifactory to enable continuous protection of images.</w:t>
+      </w:r>
+    </w:p>
+    <w:p>
+      <w:pPr>
+        <w:pStyle w:val="ListParagraph"/>
+        <w:numPr>
+          <w:ilvl w:val="0"/>
+          <w:numId w:val="46"/>
+        </w:numPr>
+        <w:spacing w:before="100" w:beforeAutospacing="1" w:line="240" w:lineRule="auto"/>
+        <w:jc w:val="both"/>
+        <w:rPr>
+          <w:rFonts w:ascii="Verdana" w:hAnsi="Verdana"/>
+        </w:rPr>
+      </w:pPr>
+      <w:r>
+        <w:rPr>
+          <w:rFonts w:ascii="Verdana" w:hAnsi="Verdana"/>
+        </w:rPr>
+        <w:t>Avoid writing confidential information in a config file or into the code that is pushed into a repository. Tools like Git Secrets prevent you from entering passwords and other classified information into a Git repository.</w:t>
+      </w:r>
+    </w:p>
+    <w:p>
+      <w:pPr>
+        <w:pStyle w:val="ListParagraph"/>
+        <w:numPr>
+          <w:ilvl w:val="0"/>
+          <w:numId w:val="46"/>
+        </w:numPr>
+        <w:spacing w:before="100" w:beforeAutospacing="1" w:line="240" w:lineRule="auto"/>
+        <w:jc w:val="both"/>
+        <w:rPr>
+          <w:rFonts w:ascii="Verdana" w:hAnsi="Verdana"/>
+        </w:rPr>
+      </w:pPr>
+      <w:r>
+        <w:rPr>
+          <w:rFonts w:ascii="Verdana" w:hAnsi="Verdana"/>
+        </w:rPr>
+        <w:t>Pull images from trusted sources and store them in your secure private repository that provides the required control for proper access management.</w:t>
+      </w:r>
+    </w:p>
+    <w:p>
+      <w:pPr>
+        <w:pStyle w:val="ListParagraph"/>
+        <w:numPr>
+          <w:ilvl w:val="0"/>
+          <w:numId w:val="46"/>
+        </w:numPr>
+        <w:spacing w:before="100" w:beforeAutospacing="1" w:line="240" w:lineRule="auto"/>
+        <w:jc w:val="both"/>
+        <w:rPr>
+          <w:rFonts w:ascii="Verdana" w:hAnsi="Verdana"/>
+        </w:rPr>
+      </w:pPr>
+      <w:r>
+        <w:rPr>
+          <w:rFonts w:ascii="Verdana" w:hAnsi="Verdana"/>
+        </w:rPr>
+        <w:t>You can also use Infrastructure as Code (</w:t>
+      </w:r>
+      <w:proofErr w:type="spellStart"/>
+      <w:r>
+        <w:rPr>
+          <w:rFonts w:ascii="Verdana" w:hAnsi="Verdana"/>
+        </w:rPr>
+        <w:t>IaC</w:t>
+      </w:r>
+      <w:proofErr w:type="spellEnd"/>
+      <w:r>
+        <w:rPr>
+          <w:rFonts w:ascii="Verdana" w:hAnsi="Verdana"/>
+        </w:rPr>
+        <w:t>) to ensure your app containers are secure when deployed.</w:t>
+      </w:r>
+    </w:p>
+    <w:p>
+      <w:pPr>
+        <w:spacing w:before="100" w:beforeAutospacing="1" w:line="240" w:lineRule="auto"/>
+        <w:jc w:val="both"/>
+        <w:rPr>
+          <w:rFonts w:ascii="Verdana" w:hAnsi="Verdana"/>
+        </w:rPr>
+      </w:pPr>
+    </w:p>
+    <w:p>
+      <w:pPr>
+        <w:spacing w:before="100" w:beforeAutospacing="1" w:line="240" w:lineRule="auto"/>
+        <w:jc w:val="both"/>
+        <w:rPr>
+          <w:rFonts w:ascii="Verdana" w:hAnsi="Verdana"/>
+        </w:rPr>
+      </w:pPr>
+    </w:p>
+    <w:p>
+      <w:pPr>
+        <w:spacing w:before="100" w:beforeAutospacing="1" w:line="240" w:lineRule="auto"/>
+        <w:jc w:val="both"/>
+        <w:rPr>
+          <w:rFonts w:ascii="Verdana" w:hAnsi="Verdana"/>
+        </w:rPr>
+      </w:pPr>
+    </w:p>
+    <w:p>
+      <w:pPr>
+        <w:spacing w:before="100" w:beforeAutospacing="1" w:line="240" w:lineRule="auto"/>
+        <w:jc w:val="both"/>
+        <w:rPr>
+          <w:rFonts w:ascii="Verdana" w:hAnsi="Verdana"/>
+        </w:rPr>
+      </w:pPr>
+      <w:r>
+        <w:rPr>
+          <w:rFonts w:ascii="Verdana" w:hAnsi="Verdana"/>
+        </w:rPr>
+        <w:lastRenderedPageBreak/>
         <w:t>6</w:t>
       </w:r>
       <w:r>
@@ -614,6 +3460,858 @@
           <w:rFonts w:ascii="Verdana" w:hAnsi="Verdana"/>
         </w:rPr>
       </w:pPr>
+      <w:r>
+        <w:rPr>
+          <w:rFonts w:ascii="Verdana" w:hAnsi="Verdana"/>
+        </w:rPr>
+        <w:t xml:space="preserve">A </w:t>
+      </w:r>
+      <w:r>
+        <w:rPr>
+          <w:rFonts w:ascii="Verdana" w:hAnsi="Verdana"/>
+          <w:b/>
+          <w:bCs/>
+        </w:rPr>
+        <w:t>classic CI pipeline</w:t>
+      </w:r>
+      <w:r>
+        <w:rPr>
+          <w:rFonts w:ascii="Verdana" w:hAnsi="Verdana"/>
+        </w:rPr>
+        <w:t xml:space="preserve"> runs build/test steps directly on the CI agent (or a shared build server) using whatever tools that machine has installed (specific .NET SDK, Node version, etc.). The artifact is typically a binary/zip/package.</w:t>
+      </w:r>
+    </w:p>
+    <w:p>
+      <w:pPr>
+        <w:spacing w:before="100" w:beforeAutospacing="1" w:line="240" w:lineRule="auto"/>
+        <w:jc w:val="both"/>
+        <w:rPr>
+          <w:rFonts w:ascii="Verdana" w:hAnsi="Verdana"/>
+        </w:rPr>
+      </w:pPr>
+      <w:r>
+        <w:rPr>
+          <w:rFonts w:ascii="Verdana" w:hAnsi="Verdana"/>
+        </w:rPr>
+        <w:t xml:space="preserve">A </w:t>
+      </w:r>
+      <w:r>
+        <w:rPr>
+          <w:rFonts w:ascii="Verdana" w:hAnsi="Verdana"/>
+          <w:b/>
+          <w:bCs/>
+        </w:rPr>
+        <w:t>Docker-based CI pipeline</w:t>
+      </w:r>
+      <w:r>
+        <w:rPr>
+          <w:rFonts w:ascii="Verdana" w:hAnsi="Verdana"/>
+        </w:rPr>
+        <w:t xml:space="preserve"> uses containers as the unit of build, test, and delivery:</w:t>
+      </w:r>
+    </w:p>
+    <w:tbl>
+      <w:tblPr>
+        <w:tblStyle w:val="TableGrid"/>
+        <w:tblW w:w="0" w:type="auto"/>
+        <w:tblLook w:val="04A0" w:firstRow="1" w:lastRow="0" w:firstColumn="1" w:lastColumn="0" w:noHBand="0" w:noVBand="1"/>
+      </w:tblPr>
+      <w:tblGrid>
+        <w:gridCol w:w="3362"/>
+        <w:gridCol w:w="2710"/>
+        <w:gridCol w:w="3278"/>
+      </w:tblGrid>
+      <w:tr>
+        <w:tc>
+          <w:tcPr>
+            <w:tcW w:w="3026" w:type="dxa"/>
+          </w:tcPr>
+          <w:p>
+            <w:pPr>
+              <w:spacing w:before="100" w:beforeAutospacing="1"/>
+              <w:jc w:val="both"/>
+              <w:rPr>
+                <w:rFonts w:ascii="Verdana" w:hAnsi="Verdana"/>
+              </w:rPr>
+            </w:pPr>
+          </w:p>
+        </w:tc>
+        <w:tc>
+          <w:tcPr>
+            <w:tcW w:w="3046" w:type="dxa"/>
+          </w:tcPr>
+          <w:p>
+            <w:pPr>
+              <w:spacing w:before="100" w:beforeAutospacing="1"/>
+              <w:jc w:val="both"/>
+              <w:rPr>
+                <w:rFonts w:ascii="Verdana" w:hAnsi="Verdana"/>
+              </w:rPr>
+            </w:pPr>
+            <w:r>
+              <w:rPr>
+                <w:rFonts w:ascii="Verdana" w:hAnsi="Verdana"/>
+              </w:rPr>
+              <w:t>Classic CI</w:t>
+            </w:r>
+          </w:p>
+        </w:tc>
+        <w:tc>
+          <w:tcPr>
+            <w:tcW w:w="3278" w:type="dxa"/>
+          </w:tcPr>
+          <w:p>
+            <w:pPr>
+              <w:spacing w:before="100" w:beforeAutospacing="1"/>
+              <w:jc w:val="both"/>
+              <w:rPr>
+                <w:rFonts w:ascii="Verdana" w:hAnsi="Verdana"/>
+              </w:rPr>
+            </w:pPr>
+            <w:r>
+              <w:rPr>
+                <w:rFonts w:ascii="Verdana" w:hAnsi="Verdana"/>
+              </w:rPr>
+              <w:t>Docker CI</w:t>
+            </w:r>
+          </w:p>
+        </w:tc>
+      </w:tr>
+      <w:tr>
+        <w:tc>
+          <w:tcPr>
+            <w:tcW w:w="3026" w:type="dxa"/>
+          </w:tcPr>
+          <w:p>
+            <w:pPr>
+              <w:spacing w:before="100" w:beforeAutospacing="1"/>
+              <w:jc w:val="both"/>
+              <w:rPr>
+                <w:rFonts w:ascii="Verdana" w:hAnsi="Verdana"/>
+                <w:b/>
+                <w:bCs/>
+              </w:rPr>
+            </w:pPr>
+            <w:r>
+              <w:rPr>
+                <w:rFonts w:ascii="Verdana" w:hAnsi="Verdana"/>
+                <w:b/>
+                <w:bCs/>
+              </w:rPr>
+              <w:t>Build environment</w:t>
+            </w:r>
+          </w:p>
+        </w:tc>
+        <w:tc>
+          <w:tcPr>
+            <w:tcW w:w="3046" w:type="dxa"/>
+          </w:tcPr>
+          <w:p>
+            <w:pPr>
+              <w:spacing w:before="100" w:beforeAutospacing="1"/>
+              <w:jc w:val="both"/>
+              <w:rPr>
+                <w:rFonts w:ascii="Verdana" w:hAnsi="Verdana"/>
+              </w:rPr>
+            </w:pPr>
+            <w:r>
+              <w:rPr>
+                <w:rFonts w:ascii="Verdana" w:hAnsi="Verdana"/>
+              </w:rPr>
+              <w:t>Tools installed on the agent</w:t>
+            </w:r>
+          </w:p>
+        </w:tc>
+        <w:tc>
+          <w:tcPr>
+            <w:tcW w:w="3278" w:type="dxa"/>
+          </w:tcPr>
+          <w:p>
+            <w:pPr>
+              <w:spacing w:before="100" w:beforeAutospacing="1"/>
+              <w:jc w:val="both"/>
+              <w:rPr>
+                <w:rFonts w:ascii="Verdana" w:hAnsi="Verdana"/>
+              </w:rPr>
+            </w:pPr>
+            <w:r>
+              <w:rPr>
+                <w:rFonts w:ascii="Verdana" w:hAnsi="Verdana"/>
+              </w:rPr>
+              <w:t>Defined in a `</w:t>
+            </w:r>
+            <w:proofErr w:type="spellStart"/>
+            <w:r>
+              <w:rPr>
+                <w:rFonts w:ascii="Verdana" w:hAnsi="Verdana"/>
+              </w:rPr>
+              <w:t>Dockerfile</w:t>
+            </w:r>
+            <w:proofErr w:type="spellEnd"/>
+            <w:r>
+              <w:rPr>
+                <w:rFonts w:ascii="Verdana" w:hAnsi="Verdana"/>
+              </w:rPr>
+              <w:t>` / runs inside containers</w:t>
+            </w:r>
+          </w:p>
+        </w:tc>
+      </w:tr>
+      <w:tr>
+        <w:tc>
+          <w:tcPr>
+            <w:tcW w:w="3026" w:type="dxa"/>
+          </w:tcPr>
+          <w:p>
+            <w:pPr>
+              <w:spacing w:before="100" w:beforeAutospacing="1"/>
+              <w:jc w:val="both"/>
+              <w:rPr>
+                <w:rFonts w:ascii="Verdana" w:hAnsi="Verdana"/>
+                <w:b/>
+                <w:bCs/>
+              </w:rPr>
+            </w:pPr>
+            <w:r>
+              <w:rPr>
+                <w:rFonts w:ascii="Verdana" w:hAnsi="Verdana"/>
+                <w:b/>
+                <w:bCs/>
+              </w:rPr>
+              <w:t>Consistency</w:t>
+            </w:r>
+          </w:p>
+        </w:tc>
+        <w:tc>
+          <w:tcPr>
+            <w:tcW w:w="3046" w:type="dxa"/>
+          </w:tcPr>
+          <w:p>
+            <w:pPr>
+              <w:spacing w:before="100" w:beforeAutospacing="1"/>
+              <w:jc w:val="both"/>
+              <w:rPr>
+                <w:rFonts w:ascii="Verdana" w:hAnsi="Verdana"/>
+              </w:rPr>
+            </w:pPr>
+            <w:r>
+              <w:rPr>
+                <w:rFonts w:ascii="Verdana" w:hAnsi="Verdana"/>
+              </w:rPr>
+              <w:t>Varies by agent ("works on the build server")</w:t>
+            </w:r>
+          </w:p>
+        </w:tc>
+        <w:tc>
+          <w:tcPr>
+            <w:tcW w:w="3278" w:type="dxa"/>
+          </w:tcPr>
+          <w:p>
+            <w:pPr>
+              <w:spacing w:before="100" w:beforeAutospacing="1"/>
+              <w:jc w:val="both"/>
+              <w:rPr>
+                <w:rFonts w:ascii="Verdana" w:hAnsi="Verdana"/>
+              </w:rPr>
+            </w:pPr>
+            <w:r>
+              <w:rPr>
+                <w:rFonts w:ascii="Verdana" w:hAnsi="Verdana"/>
+              </w:rPr>
+              <w:t xml:space="preserve">Identical everywhere — the image </w:t>
+            </w:r>
+            <w:r>
+              <w:rPr>
+                <w:rFonts w:ascii="Verdana" w:hAnsi="Verdana"/>
+                <w:b/>
+                <w:bCs/>
+              </w:rPr>
+              <w:t>is</w:t>
+            </w:r>
+            <w:r>
+              <w:rPr>
+                <w:rFonts w:ascii="Verdana" w:hAnsi="Verdana"/>
+              </w:rPr>
+              <w:t xml:space="preserve"> the environment</w:t>
+            </w:r>
+          </w:p>
+        </w:tc>
+      </w:tr>
+      <w:tr>
+        <w:tc>
+          <w:tcPr>
+            <w:tcW w:w="3026" w:type="dxa"/>
+          </w:tcPr>
+          <w:p>
+            <w:pPr>
+              <w:spacing w:before="100" w:beforeAutospacing="1"/>
+              <w:jc w:val="both"/>
+              <w:rPr>
+                <w:rFonts w:ascii="Verdana" w:hAnsi="Verdana"/>
+                <w:b/>
+                <w:bCs/>
+              </w:rPr>
+            </w:pPr>
+            <w:r>
+              <w:rPr>
+                <w:rFonts w:ascii="Verdana" w:hAnsi="Verdana"/>
+                <w:b/>
+                <w:bCs/>
+              </w:rPr>
+              <w:t>Artifact</w:t>
+            </w:r>
+          </w:p>
+        </w:tc>
+        <w:tc>
+          <w:tcPr>
+            <w:tcW w:w="3046" w:type="dxa"/>
+          </w:tcPr>
+          <w:p>
+            <w:pPr>
+              <w:spacing w:before="100" w:beforeAutospacing="1"/>
+              <w:jc w:val="both"/>
+              <w:rPr>
+                <w:rFonts w:ascii="Verdana" w:hAnsi="Verdana"/>
+              </w:rPr>
+            </w:pPr>
+            <w:r>
+              <w:rPr>
+                <w:rFonts w:ascii="Verdana" w:hAnsi="Verdana"/>
+              </w:rPr>
+              <w:t>Binaries / packages</w:t>
+            </w:r>
+          </w:p>
+        </w:tc>
+        <w:tc>
+          <w:tcPr>
+            <w:tcW w:w="3278" w:type="dxa"/>
+          </w:tcPr>
+          <w:p>
+            <w:pPr>
+              <w:spacing w:before="100" w:beforeAutospacing="1"/>
+              <w:jc w:val="both"/>
+              <w:rPr>
+                <w:rFonts w:ascii="Verdana" w:hAnsi="Verdana"/>
+              </w:rPr>
+            </w:pPr>
+            <w:r>
+              <w:rPr>
+                <w:rFonts w:ascii="Verdana" w:hAnsi="Verdana"/>
+              </w:rPr>
+              <w:t xml:space="preserve">A </w:t>
+            </w:r>
+            <w:r>
+              <w:rPr>
+                <w:rFonts w:ascii="Verdana" w:hAnsi="Verdana"/>
+              </w:rPr>
+              <w:t>version of</w:t>
+            </w:r>
+            <w:r>
+              <w:rPr>
+                <w:rFonts w:ascii="Verdana" w:hAnsi="Verdana"/>
+              </w:rPr>
+              <w:t xml:space="preserve"> </w:t>
+            </w:r>
+            <w:r>
+              <w:rPr>
+                <w:rFonts w:ascii="Verdana" w:hAnsi="Verdana"/>
+                <w:b/>
+                <w:bCs/>
+              </w:rPr>
+              <w:t>container image</w:t>
+            </w:r>
+            <w:r>
+              <w:rPr>
+                <w:rFonts w:ascii="Verdana" w:hAnsi="Verdana"/>
+              </w:rPr>
+              <w:t xml:space="preserve"> pushed to a registry</w:t>
+            </w:r>
+          </w:p>
+        </w:tc>
+      </w:tr>
+      <w:tr>
+        <w:tc>
+          <w:tcPr>
+            <w:tcW w:w="3026" w:type="dxa"/>
+          </w:tcPr>
+          <w:p>
+            <w:pPr>
+              <w:spacing w:before="100" w:beforeAutospacing="1"/>
+              <w:jc w:val="both"/>
+              <w:rPr>
+                <w:rFonts w:ascii="Verdana" w:hAnsi="Verdana"/>
+                <w:b/>
+                <w:bCs/>
+              </w:rPr>
+            </w:pPr>
+            <w:r>
+              <w:rPr>
+                <w:rFonts w:ascii="Verdana" w:hAnsi="Verdana"/>
+                <w:b/>
+                <w:bCs/>
+              </w:rPr>
+              <w:t>Dependencies for tests</w:t>
+            </w:r>
+          </w:p>
+        </w:tc>
+        <w:tc>
+          <w:tcPr>
+            <w:tcW w:w="3046" w:type="dxa"/>
+          </w:tcPr>
+          <w:p>
+            <w:pPr>
+              <w:tabs>
+                <w:tab w:val="left" w:pos="1931"/>
+              </w:tabs>
+              <w:spacing w:before="100" w:beforeAutospacing="1"/>
+              <w:jc w:val="both"/>
+              <w:rPr>
+                <w:rFonts w:ascii="Verdana" w:hAnsi="Verdana"/>
+              </w:rPr>
+            </w:pPr>
+            <w:r>
+              <w:rPr>
+                <w:rFonts w:ascii="Verdana" w:hAnsi="Verdana"/>
+              </w:rPr>
+              <w:t>Installed/mocked on the agent</w:t>
+            </w:r>
+          </w:p>
+        </w:tc>
+        <w:tc>
+          <w:tcPr>
+            <w:tcW w:w="3278" w:type="dxa"/>
+          </w:tcPr>
+          <w:p>
+            <w:pPr>
+              <w:spacing w:before="100" w:beforeAutospacing="1"/>
+              <w:jc w:val="both"/>
+              <w:rPr>
+                <w:rFonts w:ascii="Verdana" w:hAnsi="Verdana"/>
+              </w:rPr>
+            </w:pPr>
+            <w:r>
+              <w:rPr>
+                <w:rFonts w:ascii="Verdana" w:hAnsi="Verdana"/>
+              </w:rPr>
+              <w:t>Spun up as containers (e.g., a real SQL Server/Redis via Compose/</w:t>
+            </w:r>
+            <w:proofErr w:type="spellStart"/>
+            <w:r>
+              <w:rPr>
+                <w:rFonts w:ascii="Verdana" w:hAnsi="Verdana"/>
+              </w:rPr>
+              <w:t>Testcontainers</w:t>
+            </w:r>
+            <w:proofErr w:type="spellEnd"/>
+            <w:r>
+              <w:rPr>
+                <w:rFonts w:ascii="Verdana" w:hAnsi="Verdana"/>
+              </w:rPr>
+              <w:t>)</w:t>
+            </w:r>
+          </w:p>
+        </w:tc>
+      </w:tr>
+      <w:tr>
+        <w:tc>
+          <w:tcPr>
+            <w:tcW w:w="3026" w:type="dxa"/>
+          </w:tcPr>
+          <w:p>
+            <w:pPr>
+              <w:spacing w:before="100" w:beforeAutospacing="1"/>
+              <w:ind w:firstLine="720"/>
+              <w:jc w:val="both"/>
+              <w:rPr>
+                <w:rFonts w:ascii="Verdana" w:hAnsi="Verdana"/>
+                <w:b/>
+                <w:bCs/>
+              </w:rPr>
+            </w:pPr>
+            <w:r>
+              <w:rPr>
+                <w:rFonts w:ascii="Verdana" w:hAnsi="Verdana"/>
+                <w:b/>
+                <w:bCs/>
+              </w:rPr>
+              <w:t>Deploy step</w:t>
+            </w:r>
+          </w:p>
+        </w:tc>
+        <w:tc>
+          <w:tcPr>
+            <w:tcW w:w="3046" w:type="dxa"/>
+          </w:tcPr>
+          <w:p>
+            <w:pPr>
+              <w:spacing w:before="100" w:beforeAutospacing="1"/>
+              <w:jc w:val="both"/>
+              <w:rPr>
+                <w:rFonts w:ascii="Verdana" w:hAnsi="Verdana"/>
+              </w:rPr>
+            </w:pPr>
+            <w:r>
+              <w:rPr>
+                <w:rFonts w:ascii="Verdana" w:hAnsi="Verdana"/>
+              </w:rPr>
+              <w:t>Copy/install binaries onto servers</w:t>
+            </w:r>
+          </w:p>
+        </w:tc>
+        <w:tc>
+          <w:tcPr>
+            <w:tcW w:w="3278" w:type="dxa"/>
+          </w:tcPr>
+          <w:p>
+            <w:pPr>
+              <w:spacing w:before="100" w:beforeAutospacing="1"/>
+              <w:jc w:val="both"/>
+              <w:rPr>
+                <w:rFonts w:ascii="Verdana" w:hAnsi="Verdana"/>
+              </w:rPr>
+            </w:pPr>
+            <w:r>
+              <w:rPr>
+                <w:rFonts w:ascii="Verdana" w:hAnsi="Verdana"/>
+              </w:rPr>
+              <w:t>Pull and run the same image that was tested</w:t>
+            </w:r>
+          </w:p>
+        </w:tc>
+      </w:tr>
+      <w:tr>
+        <w:tc>
+          <w:tcPr>
+            <w:tcW w:w="3026" w:type="dxa"/>
+          </w:tcPr>
+          <w:p>
+            <w:pPr>
+              <w:spacing w:before="100" w:beforeAutospacing="1"/>
+              <w:ind w:firstLine="720"/>
+              <w:jc w:val="center"/>
+              <w:rPr>
+                <w:rFonts w:ascii="Verdana" w:hAnsi="Verdana"/>
+                <w:b/>
+                <w:bCs/>
+              </w:rPr>
+            </w:pPr>
+            <w:r>
+              <w:rPr>
+                <w:rFonts w:ascii="Verdana" w:hAnsi="Verdana"/>
+                <w:b/>
+                <w:bCs/>
+              </w:rPr>
+              <w:t>Isolation/cleanup</w:t>
+            </w:r>
+          </w:p>
+        </w:tc>
+        <w:tc>
+          <w:tcPr>
+            <w:tcW w:w="3046" w:type="dxa"/>
+          </w:tcPr>
+          <w:p>
+            <w:pPr>
+              <w:spacing w:before="100" w:beforeAutospacing="1"/>
+              <w:jc w:val="both"/>
+              <w:rPr>
+                <w:rFonts w:ascii="Verdana" w:hAnsi="Verdana"/>
+              </w:rPr>
+            </w:pPr>
+            <w:r>
+              <w:rPr>
+                <w:rFonts w:ascii="Verdana" w:hAnsi="Verdana"/>
+              </w:rPr>
+              <w:t>Shared agent state can leak between builds</w:t>
+            </w:r>
+          </w:p>
+        </w:tc>
+        <w:tc>
+          <w:tcPr>
+            <w:tcW w:w="3278" w:type="dxa"/>
+          </w:tcPr>
+          <w:p>
+            <w:pPr>
+              <w:spacing w:before="100" w:beforeAutospacing="1"/>
+              <w:jc w:val="both"/>
+              <w:rPr>
+                <w:rFonts w:ascii="Verdana" w:hAnsi="Verdana"/>
+              </w:rPr>
+            </w:pPr>
+            <w:r>
+              <w:rPr>
+                <w:rFonts w:ascii="Verdana" w:hAnsi="Verdana"/>
+              </w:rPr>
+              <w:t>Each build is clean and isolated</w:t>
+            </w:r>
+          </w:p>
+        </w:tc>
+      </w:tr>
+    </w:tbl>
+    <w:p>
+      <w:pPr>
+        <w:spacing w:before="100" w:beforeAutospacing="1" w:line="240" w:lineRule="auto"/>
+        <w:jc w:val="both"/>
+        <w:rPr>
+          <w:rFonts w:ascii="Verdana" w:hAnsi="Verdana"/>
+        </w:rPr>
+      </w:pPr>
+      <w:r>
+        <w:rPr>
+          <w:rFonts w:ascii="Verdana" w:hAnsi="Verdana"/>
+        </w:rPr>
+        <w:t>Key differences/benefits:</w:t>
+      </w:r>
+    </w:p>
+    <w:p>
+      <w:pPr>
+        <w:spacing w:before="100" w:beforeAutospacing="1" w:line="240" w:lineRule="auto"/>
+        <w:jc w:val="both"/>
+        <w:rPr>
+          <w:rFonts w:ascii="Verdana" w:hAnsi="Verdana"/>
+        </w:rPr>
+      </w:pPr>
+      <w:r>
+        <w:rPr>
+          <w:rFonts w:ascii="Verdana" w:hAnsi="Verdana"/>
+        </w:rPr>
+        <w:t xml:space="preserve">- </w:t>
+      </w:r>
+      <w:r>
+        <w:rPr>
+          <w:rFonts w:ascii="Verdana" w:hAnsi="Verdana"/>
+          <w:b/>
+          <w:bCs/>
+        </w:rPr>
+        <w:t>Environment parity</w:t>
+      </w:r>
+      <w:r>
+        <w:rPr>
+          <w:rFonts w:ascii="Verdana" w:hAnsi="Verdana"/>
+        </w:rPr>
+        <w:t xml:space="preserve"> – the exact image you tested is the exact image you deploy ("the artifact is the environment"). No drift between CI and prod.</w:t>
+      </w:r>
+    </w:p>
+    <w:p>
+      <w:pPr>
+        <w:spacing w:before="100" w:beforeAutospacing="1" w:line="240" w:lineRule="auto"/>
+        <w:jc w:val="both"/>
+        <w:rPr>
+          <w:rFonts w:ascii="Verdana" w:hAnsi="Verdana"/>
+        </w:rPr>
+      </w:pPr>
+      <w:r>
+        <w:rPr>
+          <w:rFonts w:ascii="Verdana" w:hAnsi="Verdana"/>
+        </w:rPr>
+        <w:t xml:space="preserve">- </w:t>
+      </w:r>
+      <w:r>
+        <w:rPr>
+          <w:rFonts w:ascii="Verdana" w:hAnsi="Verdana"/>
+          <w:b/>
+          <w:bCs/>
+        </w:rPr>
+        <w:t>Reproducibility &amp; isolation</w:t>
+      </w:r>
+      <w:r>
+        <w:rPr>
+          <w:rFonts w:ascii="Verdana" w:hAnsi="Verdana"/>
+        </w:rPr>
+        <w:t xml:space="preserve"> – builds don't depend on what's pre-installed on the agent; no cross-build contamination.</w:t>
+      </w:r>
+    </w:p>
+    <w:p>
+      <w:pPr>
+        <w:spacing w:before="100" w:beforeAutospacing="1" w:line="240" w:lineRule="auto"/>
+        <w:jc w:val="both"/>
+        <w:rPr>
+          <w:rFonts w:ascii="Verdana" w:hAnsi="Verdana"/>
+        </w:rPr>
+      </w:pPr>
+      <w:r>
+        <w:rPr>
+          <w:rFonts w:ascii="Verdana" w:hAnsi="Verdana"/>
+        </w:rPr>
+        <w:t xml:space="preserve">- </w:t>
+      </w:r>
+      <w:r>
+        <w:rPr>
+          <w:rFonts w:ascii="Verdana" w:hAnsi="Verdana"/>
+          <w:b/>
+          <w:bCs/>
+        </w:rPr>
+        <w:t>Realistic integration tests</w:t>
+      </w:r>
+      <w:r>
+        <w:rPr>
+          <w:rFonts w:ascii="Verdana" w:hAnsi="Verdana"/>
+        </w:rPr>
+        <w:t xml:space="preserve"> – you can boot real dependencies as containers (this project's `</w:t>
+      </w:r>
+      <w:proofErr w:type="spellStart"/>
+      <w:r>
+        <w:rPr>
+          <w:rFonts w:ascii="Verdana" w:hAnsi="Verdana"/>
+        </w:rPr>
+        <w:t>CatalogService.IntegrationTests</w:t>
+      </w:r>
+      <w:proofErr w:type="spellEnd"/>
+      <w:r>
+        <w:rPr>
+          <w:rFonts w:ascii="Verdana" w:hAnsi="Verdana"/>
+        </w:rPr>
+        <w:t xml:space="preserve">` + SQL Server is a natural fit, e.g., via </w:t>
+      </w:r>
+      <w:proofErr w:type="spellStart"/>
+      <w:r>
+        <w:rPr>
+          <w:rFonts w:ascii="Verdana" w:hAnsi="Verdana"/>
+        </w:rPr>
+        <w:t>Testcontainers</w:t>
+      </w:r>
+      <w:proofErr w:type="spellEnd"/>
+      <w:r>
+        <w:rPr>
+          <w:rFonts w:ascii="Verdana" w:hAnsi="Verdana"/>
+        </w:rPr>
+        <w:t>).</w:t>
+      </w:r>
+    </w:p>
+    <w:p>
+      <w:pPr>
+        <w:spacing w:before="100" w:beforeAutospacing="1" w:line="240" w:lineRule="auto"/>
+        <w:jc w:val="both"/>
+        <w:rPr>
+          <w:rFonts w:ascii="Verdana" w:hAnsi="Verdana"/>
+        </w:rPr>
+      </w:pPr>
+      <w:r>
+        <w:rPr>
+          <w:rFonts w:ascii="Verdana" w:hAnsi="Verdana"/>
+        </w:rPr>
+        <w:t xml:space="preserve">- </w:t>
+      </w:r>
+      <w:r>
+        <w:rPr>
+          <w:rFonts w:ascii="Verdana" w:hAnsi="Verdana"/>
+          <w:b/>
+          <w:bCs/>
+        </w:rPr>
+        <w:t>Self-contained agents</w:t>
+      </w:r>
+      <w:r>
+        <w:rPr>
+          <w:rFonts w:ascii="Verdana" w:hAnsi="Verdana"/>
+        </w:rPr>
+        <w:t xml:space="preserve"> – the CI runner only needs Docker, not a dozen language toolchains.</w:t>
+      </w:r>
+    </w:p>
+    <w:p>
+      <w:pPr>
+        <w:spacing w:before="100" w:beforeAutospacing="1" w:line="240" w:lineRule="auto"/>
+        <w:jc w:val="both"/>
+        <w:rPr>
+          <w:rFonts w:ascii="Verdana" w:hAnsi="Verdana"/>
+        </w:rPr>
+      </w:pPr>
+      <w:r>
+        <w:rPr>
+          <w:rFonts w:ascii="Verdana" w:hAnsi="Verdana"/>
+        </w:rPr>
+        <w:lastRenderedPageBreak/>
+        <w:t xml:space="preserve">Trade-offs: image build/pull adds time (mitigated by layer </w:t>
+      </w:r>
+      <w:proofErr w:type="gramStart"/>
+      <w:r>
+        <w:rPr>
+          <w:rFonts w:ascii="Verdana" w:hAnsi="Verdana"/>
+        </w:rPr>
+        <w:t>caching</w:t>
+      </w:r>
+      <w:proofErr w:type="gramEnd"/>
+      <w:r>
+        <w:rPr>
+          <w:rFonts w:ascii="Verdana" w:hAnsi="Verdana"/>
+        </w:rPr>
+        <w:t xml:space="preserve"> and registries), and you take on image security/registry management.</w:t>
+      </w:r>
+    </w:p>
+    <w:p>
+      <w:pPr>
+        <w:tabs>
+          <w:tab w:val="left" w:pos="1440"/>
+        </w:tabs>
+        <w:spacing w:before="100" w:beforeAutospacing="1" w:line="240" w:lineRule="auto"/>
+        <w:jc w:val="both"/>
+        <w:rPr>
+          <w:rFonts w:ascii="Verdana" w:hAnsi="Verdana"/>
+        </w:rPr>
+      </w:pPr>
+    </w:p>
+    <w:p>
+      <w:pPr>
+        <w:spacing w:before="100" w:beforeAutospacing="1" w:line="240" w:lineRule="auto"/>
+        <w:jc w:val="both"/>
+        <w:rPr>
+          <w:rFonts w:ascii="Verdana" w:hAnsi="Verdana"/>
+        </w:rPr>
+      </w:pPr>
+      <w:r>
+        <w:rPr>
+          <w:rFonts w:ascii="Verdana" w:hAnsi="Verdana"/>
+        </w:rPr>
+        <w:t xml:space="preserve">&gt; In this repo, a Docker CI flow would </w:t>
+      </w:r>
+      <w:proofErr w:type="gramStart"/>
+      <w:r>
+        <w:rPr>
+          <w:rFonts w:ascii="Verdana" w:hAnsi="Verdana"/>
+        </w:rPr>
+        <w:t>be:</w:t>
+      </w:r>
+      <w:proofErr w:type="gramEnd"/>
+      <w:r>
+        <w:rPr>
+          <w:rFonts w:ascii="Verdana" w:hAnsi="Verdana"/>
+        </w:rPr>
+        <w:t xml:space="preserve"> build the `catalog-service`/`cart-service` images </w:t>
+      </w:r>
+      <w:r>
+        <w:rPr>
+          <w:rFonts w:ascii="Arial" w:hAnsi="Arial" w:cs="Arial"/>
+        </w:rPr>
+        <w:t>→</w:t>
+      </w:r>
+      <w:r>
+        <w:rPr>
+          <w:rFonts w:ascii="Verdana" w:hAnsi="Verdana"/>
+        </w:rPr>
+        <w:t xml:space="preserve"> run unit + integration tests (with dependency containers) </w:t>
+      </w:r>
+      <w:r>
+        <w:rPr>
+          <w:rFonts w:ascii="Arial" w:hAnsi="Arial" w:cs="Arial"/>
+        </w:rPr>
+        <w:t>→</w:t>
+      </w:r>
+      <w:r>
+        <w:rPr>
+          <w:rFonts w:ascii="Verdana" w:hAnsi="Verdana"/>
+        </w:rPr>
+        <w:t xml:space="preserve"> push the tagged images to a registry </w:t>
+      </w:r>
+      <w:r>
+        <w:rPr>
+          <w:rFonts w:ascii="Arial" w:hAnsi="Arial" w:cs="Arial"/>
+        </w:rPr>
+        <w:t>→</w:t>
+      </w:r>
+      <w:r>
+        <w:rPr>
+          <w:rFonts w:ascii="Verdana" w:hAnsi="Verdana"/>
+        </w:rPr>
+        <w:t xml:space="preserve"> deploy that same image to the target environment (Compose or Kubernetes).</w:t>
+      </w:r>
     </w:p>
     <w:sectPr>
       <w:pgSz w:w="12240" w:h="15840"/>
@@ -2049,6 +5747,119 @@
     </w:lvl>
   </w:abstractNum>
   <w:abstractNum w:abstractNumId="12" w15:restartNumberingAfterBreak="0">
+    <w:nsid w:val="2214215C"/>
+    <w:multiLevelType w:val="hybridMultilevel"/>
+    <w:tmpl w:val="1EAE538A"/>
+    <w:lvl w:ilvl="0" w:tplc="04090001">
+      <w:start w:val="1"/>
+      <w:numFmt w:val="bullet"/>
+      <w:lvlText w:val=""/>
+      <w:lvlJc w:val="left"/>
+      <w:pPr>
+        <w:ind w:left="720" w:hanging="360"/>
+      </w:pPr>
+      <w:rPr>
+        <w:rFonts w:ascii="Symbol" w:hAnsi="Symbol" w:hint="default"/>
+      </w:rPr>
+    </w:lvl>
+    <w:lvl w:ilvl="1" w:tplc="04090003" w:tentative="1">
+      <w:start w:val="1"/>
+      <w:numFmt w:val="bullet"/>
+      <w:lvlText w:val="o"/>
+      <w:lvlJc w:val="left"/>
+      <w:pPr>
+        <w:ind w:left="1440" w:hanging="360"/>
+      </w:pPr>
+      <w:rPr>
+        <w:rFonts w:ascii="Courier New" w:hAnsi="Courier New" w:cs="Courier New" w:hint="default"/>
+      </w:rPr>
+    </w:lvl>
+    <w:lvl w:ilvl="2" w:tplc="04090005" w:tentative="1">
+      <w:start w:val="1"/>
+      <w:numFmt w:val="bullet"/>
+      <w:lvlText w:val=""/>
+      <w:lvlJc w:val="left"/>
+      <w:pPr>
+        <w:ind w:left="2160" w:hanging="360"/>
+      </w:pPr>
+      <w:rPr>
+        <w:rFonts w:ascii="Wingdings" w:hAnsi="Wingdings" w:hint="default"/>
+      </w:rPr>
+    </w:lvl>
+    <w:lvl w:ilvl="3" w:tplc="04090001" w:tentative="1">
+      <w:start w:val="1"/>
+      <w:numFmt w:val="bullet"/>
+      <w:lvlText w:val=""/>
+      <w:lvlJc w:val="left"/>
+      <w:pPr>
+        <w:ind w:left="2880" w:hanging="360"/>
+      </w:pPr>
+      <w:rPr>
+        <w:rFonts w:ascii="Symbol" w:hAnsi="Symbol" w:hint="default"/>
+      </w:rPr>
+    </w:lvl>
+    <w:lvl w:ilvl="4" w:tplc="04090003" w:tentative="1">
+      <w:start w:val="1"/>
+      <w:numFmt w:val="bullet"/>
+      <w:lvlText w:val="o"/>
+      <w:lvlJc w:val="left"/>
+      <w:pPr>
+        <w:ind w:left="3600" w:hanging="360"/>
+      </w:pPr>
+      <w:rPr>
+        <w:rFonts w:ascii="Courier New" w:hAnsi="Courier New" w:cs="Courier New" w:hint="default"/>
+      </w:rPr>
+    </w:lvl>
+    <w:lvl w:ilvl="5" w:tplc="04090005" w:tentative="1">
+      <w:start w:val="1"/>
+      <w:numFmt w:val="bullet"/>
+      <w:lvlText w:val=""/>
+      <w:lvlJc w:val="left"/>
+      <w:pPr>
+        <w:ind w:left="4320" w:hanging="360"/>
+      </w:pPr>
+      <w:rPr>
+        <w:rFonts w:ascii="Wingdings" w:hAnsi="Wingdings" w:hint="default"/>
+      </w:rPr>
+    </w:lvl>
+    <w:lvl w:ilvl="6" w:tplc="04090001" w:tentative="1">
+      <w:start w:val="1"/>
+      <w:numFmt w:val="bullet"/>
+      <w:lvlText w:val=""/>
+      <w:lvlJc w:val="left"/>
+      <w:pPr>
+        <w:ind w:left="5040" w:hanging="360"/>
+      </w:pPr>
+      <w:rPr>
+        <w:rFonts w:ascii="Symbol" w:hAnsi="Symbol" w:hint="default"/>
+      </w:rPr>
+    </w:lvl>
+    <w:lvl w:ilvl="7" w:tplc="04090003" w:tentative="1">
+      <w:start w:val="1"/>
+      <w:numFmt w:val="bullet"/>
+      <w:lvlText w:val="o"/>
+      <w:lvlJc w:val="left"/>
+      <w:pPr>
+        <w:ind w:left="5760" w:hanging="360"/>
+      </w:pPr>
+      <w:rPr>
+        <w:rFonts w:ascii="Courier New" w:hAnsi="Courier New" w:cs="Courier New" w:hint="default"/>
+      </w:rPr>
+    </w:lvl>
+    <w:lvl w:ilvl="8" w:tplc="04090005" w:tentative="1">
+      <w:start w:val="1"/>
+      <w:numFmt w:val="bullet"/>
+      <w:lvlText w:val=""/>
+      <w:lvlJc w:val="left"/>
+      <w:pPr>
+        <w:ind w:left="6480" w:hanging="360"/>
+      </w:pPr>
+      <w:rPr>
+        <w:rFonts w:ascii="Wingdings" w:hAnsi="Wingdings" w:hint="default"/>
+      </w:rPr>
+    </w:lvl>
+  </w:abstractNum>
+  <w:abstractNum w:abstractNumId="13" w15:restartNumberingAfterBreak="0">
     <w:nsid w:val="228624FE"/>
     <w:multiLevelType w:val="hybridMultilevel"/>
     <w:tmpl w:val="D4B01354"/>
@@ -2161,7 +5972,7 @@
       </w:rPr>
     </w:lvl>
   </w:abstractNum>
-  <w:abstractNum w:abstractNumId="13" w15:restartNumberingAfterBreak="0">
+  <w:abstractNum w:abstractNumId="14" w15:restartNumberingAfterBreak="0">
     <w:nsid w:val="22BE0493"/>
     <w:multiLevelType w:val="hybridMultilevel"/>
     <w:tmpl w:val="6ACEE2AE"/>
@@ -2274,7 +6085,120 @@
       </w:rPr>
     </w:lvl>
   </w:abstractNum>
-  <w:abstractNum w:abstractNumId="14" w15:restartNumberingAfterBreak="0">
+  <w:abstractNum w:abstractNumId="15" w15:restartNumberingAfterBreak="0">
+    <w:nsid w:val="27C43A92"/>
+    <w:multiLevelType w:val="hybridMultilevel"/>
+    <w:tmpl w:val="870406E6"/>
+    <w:lvl w:ilvl="0" w:tplc="04090001">
+      <w:start w:val="1"/>
+      <w:numFmt w:val="bullet"/>
+      <w:lvlText w:val=""/>
+      <w:lvlJc w:val="left"/>
+      <w:pPr>
+        <w:ind w:left="720" w:hanging="360"/>
+      </w:pPr>
+      <w:rPr>
+        <w:rFonts w:ascii="Symbol" w:hAnsi="Symbol" w:hint="default"/>
+      </w:rPr>
+    </w:lvl>
+    <w:lvl w:ilvl="1" w:tplc="04090003" w:tentative="1">
+      <w:start w:val="1"/>
+      <w:numFmt w:val="bullet"/>
+      <w:lvlText w:val="o"/>
+      <w:lvlJc w:val="left"/>
+      <w:pPr>
+        <w:ind w:left="1440" w:hanging="360"/>
+      </w:pPr>
+      <w:rPr>
+        <w:rFonts w:ascii="Courier New" w:hAnsi="Courier New" w:cs="Courier New" w:hint="default"/>
+      </w:rPr>
+    </w:lvl>
+    <w:lvl w:ilvl="2" w:tplc="04090005" w:tentative="1">
+      <w:start w:val="1"/>
+      <w:numFmt w:val="bullet"/>
+      <w:lvlText w:val=""/>
+      <w:lvlJc w:val="left"/>
+      <w:pPr>
+        <w:ind w:left="2160" w:hanging="360"/>
+      </w:pPr>
+      <w:rPr>
+        <w:rFonts w:ascii="Wingdings" w:hAnsi="Wingdings" w:hint="default"/>
+      </w:rPr>
+    </w:lvl>
+    <w:lvl w:ilvl="3" w:tplc="04090001" w:tentative="1">
+      <w:start w:val="1"/>
+      <w:numFmt w:val="bullet"/>
+      <w:lvlText w:val=""/>
+      <w:lvlJc w:val="left"/>
+      <w:pPr>
+        <w:ind w:left="2880" w:hanging="360"/>
+      </w:pPr>
+      <w:rPr>
+        <w:rFonts w:ascii="Symbol" w:hAnsi="Symbol" w:hint="default"/>
+      </w:rPr>
+    </w:lvl>
+    <w:lvl w:ilvl="4" w:tplc="04090003" w:tentative="1">
+      <w:start w:val="1"/>
+      <w:numFmt w:val="bullet"/>
+      <w:lvlText w:val="o"/>
+      <w:lvlJc w:val="left"/>
+      <w:pPr>
+        <w:ind w:left="3600" w:hanging="360"/>
+      </w:pPr>
+      <w:rPr>
+        <w:rFonts w:ascii="Courier New" w:hAnsi="Courier New" w:cs="Courier New" w:hint="default"/>
+      </w:rPr>
+    </w:lvl>
+    <w:lvl w:ilvl="5" w:tplc="04090005" w:tentative="1">
+      <w:start w:val="1"/>
+      <w:numFmt w:val="bullet"/>
+      <w:lvlText w:val=""/>
+      <w:lvlJc w:val="left"/>
+      <w:pPr>
+        <w:ind w:left="4320" w:hanging="360"/>
+      </w:pPr>
+      <w:rPr>
+        <w:rFonts w:ascii="Wingdings" w:hAnsi="Wingdings" w:hint="default"/>
+      </w:rPr>
+    </w:lvl>
+    <w:lvl w:ilvl="6" w:tplc="04090001" w:tentative="1">
+      <w:start w:val="1"/>
+      <w:numFmt w:val="bullet"/>
+      <w:lvlText w:val=""/>
+      <w:lvlJc w:val="left"/>
+      <w:pPr>
+        <w:ind w:left="5040" w:hanging="360"/>
+      </w:pPr>
+      <w:rPr>
+        <w:rFonts w:ascii="Symbol" w:hAnsi="Symbol" w:hint="default"/>
+      </w:rPr>
+    </w:lvl>
+    <w:lvl w:ilvl="7" w:tplc="04090003" w:tentative="1">
+      <w:start w:val="1"/>
+      <w:numFmt w:val="bullet"/>
+      <w:lvlText w:val="o"/>
+      <w:lvlJc w:val="left"/>
+      <w:pPr>
+        <w:ind w:left="5760" w:hanging="360"/>
+      </w:pPr>
+      <w:rPr>
+        <w:rFonts w:ascii="Courier New" w:hAnsi="Courier New" w:cs="Courier New" w:hint="default"/>
+      </w:rPr>
+    </w:lvl>
+    <w:lvl w:ilvl="8" w:tplc="04090005" w:tentative="1">
+      <w:start w:val="1"/>
+      <w:numFmt w:val="bullet"/>
+      <w:lvlText w:val=""/>
+      <w:lvlJc w:val="left"/>
+      <w:pPr>
+        <w:ind w:left="6480" w:hanging="360"/>
+      </w:pPr>
+      <w:rPr>
+        <w:rFonts w:ascii="Wingdings" w:hAnsi="Wingdings" w:hint="default"/>
+      </w:rPr>
+    </w:lvl>
+  </w:abstractNum>
+  <w:abstractNum w:abstractNumId="16" w15:restartNumberingAfterBreak="0">
     <w:nsid w:val="2FF9243D"/>
     <w:multiLevelType w:val="multilevel"/>
     <w:tmpl w:val="CB8E940A"/>
@@ -2387,7 +6311,7 @@
       </w:pPr>
     </w:lvl>
   </w:abstractNum>
-  <w:abstractNum w:abstractNumId="15" w15:restartNumberingAfterBreak="0">
+  <w:abstractNum w:abstractNumId="17" w15:restartNumberingAfterBreak="0">
     <w:nsid w:val="340C5F39"/>
     <w:multiLevelType w:val="hybridMultilevel"/>
     <w:tmpl w:val="D3142540"/>
@@ -2500,7 +6424,7 @@
       </w:rPr>
     </w:lvl>
   </w:abstractNum>
-  <w:abstractNum w:abstractNumId="16" w15:restartNumberingAfterBreak="0">
+  <w:abstractNum w:abstractNumId="18" w15:restartNumberingAfterBreak="0">
     <w:nsid w:val="36547103"/>
     <w:multiLevelType w:val="hybridMultilevel"/>
     <w:tmpl w:val="8B88612A"/>
@@ -2613,7 +6537,7 @@
       </w:rPr>
     </w:lvl>
   </w:abstractNum>
-  <w:abstractNum w:abstractNumId="17" w15:restartNumberingAfterBreak="0">
+  <w:abstractNum w:abstractNumId="19" w15:restartNumberingAfterBreak="0">
     <w:nsid w:val="36A342EF"/>
     <w:multiLevelType w:val="hybridMultilevel"/>
     <w:tmpl w:val="07E68002"/>
@@ -2726,7 +6650,7 @@
       </w:rPr>
     </w:lvl>
   </w:abstractNum>
-  <w:abstractNum w:abstractNumId="18" w15:restartNumberingAfterBreak="0">
+  <w:abstractNum w:abstractNumId="20" w15:restartNumberingAfterBreak="0">
     <w:nsid w:val="37B55C5F"/>
     <w:multiLevelType w:val="multilevel"/>
     <w:tmpl w:val="DEC01610"/>
@@ -2875,7 +6799,7 @@
       </w:rPr>
     </w:lvl>
   </w:abstractNum>
-  <w:abstractNum w:abstractNumId="19" w15:restartNumberingAfterBreak="0">
+  <w:abstractNum w:abstractNumId="21" w15:restartNumberingAfterBreak="0">
     <w:nsid w:val="3A5A3D29"/>
     <w:multiLevelType w:val="hybridMultilevel"/>
     <w:tmpl w:val="26141842"/>
@@ -2988,7 +6912,7 @@
       </w:rPr>
     </w:lvl>
   </w:abstractNum>
-  <w:abstractNum w:abstractNumId="20" w15:restartNumberingAfterBreak="0">
+  <w:abstractNum w:abstractNumId="22" w15:restartNumberingAfterBreak="0">
     <w:nsid w:val="3CCC2CE8"/>
     <w:multiLevelType w:val="hybridMultilevel"/>
     <w:tmpl w:val="1BC243FA"/>
@@ -3074,7 +6998,120 @@
       </w:pPr>
     </w:lvl>
   </w:abstractNum>
-  <w:abstractNum w:abstractNumId="21" w15:restartNumberingAfterBreak="0">
+  <w:abstractNum w:abstractNumId="23" w15:restartNumberingAfterBreak="0">
+    <w:nsid w:val="400B347D"/>
+    <w:multiLevelType w:val="hybridMultilevel"/>
+    <w:tmpl w:val="9EA805DE"/>
+    <w:lvl w:ilvl="0" w:tplc="04090001">
+      <w:start w:val="1"/>
+      <w:numFmt w:val="bullet"/>
+      <w:lvlText w:val=""/>
+      <w:lvlJc w:val="left"/>
+      <w:pPr>
+        <w:ind w:left="720" w:hanging="360"/>
+      </w:pPr>
+      <w:rPr>
+        <w:rFonts w:ascii="Symbol" w:hAnsi="Symbol" w:hint="default"/>
+      </w:rPr>
+    </w:lvl>
+    <w:lvl w:ilvl="1" w:tplc="04090003" w:tentative="1">
+      <w:start w:val="1"/>
+      <w:numFmt w:val="bullet"/>
+      <w:lvlText w:val="o"/>
+      <w:lvlJc w:val="left"/>
+      <w:pPr>
+        <w:ind w:left="1440" w:hanging="360"/>
+      </w:pPr>
+      <w:rPr>
+        <w:rFonts w:ascii="Courier New" w:hAnsi="Courier New" w:cs="Courier New" w:hint="default"/>
+      </w:rPr>
+    </w:lvl>
+    <w:lvl w:ilvl="2" w:tplc="04090005" w:tentative="1">
+      <w:start w:val="1"/>
+      <w:numFmt w:val="bullet"/>
+      <w:lvlText w:val=""/>
+      <w:lvlJc w:val="left"/>
+      <w:pPr>
+        <w:ind w:left="2160" w:hanging="360"/>
+      </w:pPr>
+      <w:rPr>
+        <w:rFonts w:ascii="Wingdings" w:hAnsi="Wingdings" w:hint="default"/>
+      </w:rPr>
+    </w:lvl>
+    <w:lvl w:ilvl="3" w:tplc="04090001" w:tentative="1">
+      <w:start w:val="1"/>
+      <w:numFmt w:val="bullet"/>
+      <w:lvlText w:val=""/>
+      <w:lvlJc w:val="left"/>
+      <w:pPr>
+        <w:ind w:left="2880" w:hanging="360"/>
+      </w:pPr>
+      <w:rPr>
+        <w:rFonts w:ascii="Symbol" w:hAnsi="Symbol" w:hint="default"/>
+      </w:rPr>
+    </w:lvl>
+    <w:lvl w:ilvl="4" w:tplc="04090003" w:tentative="1">
+      <w:start w:val="1"/>
+      <w:numFmt w:val="bullet"/>
+      <w:lvlText w:val="o"/>
+      <w:lvlJc w:val="left"/>
+      <w:pPr>
+        <w:ind w:left="3600" w:hanging="360"/>
+      </w:pPr>
+      <w:rPr>
+        <w:rFonts w:ascii="Courier New" w:hAnsi="Courier New" w:cs="Courier New" w:hint="default"/>
+      </w:rPr>
+    </w:lvl>
+    <w:lvl w:ilvl="5" w:tplc="04090005" w:tentative="1">
+      <w:start w:val="1"/>
+      <w:numFmt w:val="bullet"/>
+      <w:lvlText w:val=""/>
+      <w:lvlJc w:val="left"/>
+      <w:pPr>
+        <w:ind w:left="4320" w:hanging="360"/>
+      </w:pPr>
+      <w:rPr>
+        <w:rFonts w:ascii="Wingdings" w:hAnsi="Wingdings" w:hint="default"/>
+      </w:rPr>
+    </w:lvl>
+    <w:lvl w:ilvl="6" w:tplc="04090001" w:tentative="1">
+      <w:start w:val="1"/>
+      <w:numFmt w:val="bullet"/>
+      <w:lvlText w:val=""/>
+      <w:lvlJc w:val="left"/>
+      <w:pPr>
+        <w:ind w:left="5040" w:hanging="360"/>
+      </w:pPr>
+      <w:rPr>
+        <w:rFonts w:ascii="Symbol" w:hAnsi="Symbol" w:hint="default"/>
+      </w:rPr>
+    </w:lvl>
+    <w:lvl w:ilvl="7" w:tplc="04090003" w:tentative="1">
+      <w:start w:val="1"/>
+      <w:numFmt w:val="bullet"/>
+      <w:lvlText w:val="o"/>
+      <w:lvlJc w:val="left"/>
+      <w:pPr>
+        <w:ind w:left="5760" w:hanging="360"/>
+      </w:pPr>
+      <w:rPr>
+        <w:rFonts w:ascii="Courier New" w:hAnsi="Courier New" w:cs="Courier New" w:hint="default"/>
+      </w:rPr>
+    </w:lvl>
+    <w:lvl w:ilvl="8" w:tplc="04090005" w:tentative="1">
+      <w:start w:val="1"/>
+      <w:numFmt w:val="bullet"/>
+      <w:lvlText w:val=""/>
+      <w:lvlJc w:val="left"/>
+      <w:pPr>
+        <w:ind w:left="6480" w:hanging="360"/>
+      </w:pPr>
+      <w:rPr>
+        <w:rFonts w:ascii="Wingdings" w:hAnsi="Wingdings" w:hint="default"/>
+      </w:rPr>
+    </w:lvl>
+  </w:abstractNum>
+  <w:abstractNum w:abstractNumId="24" w15:restartNumberingAfterBreak="0">
     <w:nsid w:val="48DF548A"/>
     <w:multiLevelType w:val="multilevel"/>
     <w:tmpl w:val="DE90F8B0"/>
@@ -3212,7 +7249,7 @@
       </w:rPr>
     </w:lvl>
   </w:abstractNum>
-  <w:abstractNum w:abstractNumId="22" w15:restartNumberingAfterBreak="0">
+  <w:abstractNum w:abstractNumId="25" w15:restartNumberingAfterBreak="0">
     <w:nsid w:val="50CB51E2"/>
     <w:multiLevelType w:val="hybridMultilevel"/>
     <w:tmpl w:val="368AB762"/>
@@ -3325,7 +7362,7 @@
       </w:rPr>
     </w:lvl>
   </w:abstractNum>
-  <w:abstractNum w:abstractNumId="23" w15:restartNumberingAfterBreak="0">
+  <w:abstractNum w:abstractNumId="26" w15:restartNumberingAfterBreak="0">
     <w:nsid w:val="510E490A"/>
     <w:multiLevelType w:val="multilevel"/>
     <w:tmpl w:val="827C601E"/>
@@ -3442,7 +7479,7 @@
       </w:pPr>
     </w:lvl>
   </w:abstractNum>
-  <w:abstractNum w:abstractNumId="24" w15:restartNumberingAfterBreak="0">
+  <w:abstractNum w:abstractNumId="27" w15:restartNumberingAfterBreak="0">
     <w:nsid w:val="557B21A8"/>
     <w:multiLevelType w:val="multilevel"/>
     <w:tmpl w:val="D84C8D4C"/>
@@ -3591,7 +7628,7 @@
       </w:rPr>
     </w:lvl>
   </w:abstractNum>
-  <w:abstractNum w:abstractNumId="25" w15:restartNumberingAfterBreak="0">
+  <w:abstractNum w:abstractNumId="28" w15:restartNumberingAfterBreak="0">
     <w:nsid w:val="58074FA5"/>
     <w:multiLevelType w:val="multilevel"/>
     <w:tmpl w:val="509AB566"/>
@@ -3740,7 +7777,7 @@
       </w:rPr>
     </w:lvl>
   </w:abstractNum>
-  <w:abstractNum w:abstractNumId="26" w15:restartNumberingAfterBreak="0">
+  <w:abstractNum w:abstractNumId="29" w15:restartNumberingAfterBreak="0">
     <w:nsid w:val="5B7A1237"/>
     <w:multiLevelType w:val="hybridMultilevel"/>
     <w:tmpl w:val="DAFE04A0"/>
@@ -3853,7 +7890,7 @@
       </w:rPr>
     </w:lvl>
   </w:abstractNum>
-  <w:abstractNum w:abstractNumId="27" w15:restartNumberingAfterBreak="0">
+  <w:abstractNum w:abstractNumId="30" w15:restartNumberingAfterBreak="0">
     <w:nsid w:val="5ED71624"/>
     <w:multiLevelType w:val="multilevel"/>
     <w:tmpl w:val="2A8A514E"/>
@@ -3970,7 +8007,7 @@
       </w:pPr>
     </w:lvl>
   </w:abstractNum>
-  <w:abstractNum w:abstractNumId="28" w15:restartNumberingAfterBreak="0">
+  <w:abstractNum w:abstractNumId="31" w15:restartNumberingAfterBreak="0">
     <w:nsid w:val="64124DFD"/>
     <w:multiLevelType w:val="hybridMultilevel"/>
     <w:tmpl w:val="66D0B646"/>
@@ -4083,7 +8120,7 @@
       </w:rPr>
     </w:lvl>
   </w:abstractNum>
-  <w:abstractNum w:abstractNumId="29" w15:restartNumberingAfterBreak="0">
+  <w:abstractNum w:abstractNumId="32" w15:restartNumberingAfterBreak="0">
     <w:nsid w:val="649F78F2"/>
     <w:multiLevelType w:val="hybridMultilevel"/>
     <w:tmpl w:val="6ACEF3CE"/>
@@ -4196,7 +8233,7 @@
       </w:rPr>
     </w:lvl>
   </w:abstractNum>
-  <w:abstractNum w:abstractNumId="30" w15:restartNumberingAfterBreak="0">
+  <w:abstractNum w:abstractNumId="33" w15:restartNumberingAfterBreak="0">
     <w:nsid w:val="66047616"/>
     <w:multiLevelType w:val="multilevel"/>
     <w:tmpl w:val="64DE04DC"/>
@@ -4345,7 +8382,7 @@
       </w:rPr>
     </w:lvl>
   </w:abstractNum>
-  <w:abstractNum w:abstractNumId="31" w15:restartNumberingAfterBreak="0">
+  <w:abstractNum w:abstractNumId="34" w15:restartNumberingAfterBreak="0">
     <w:nsid w:val="6B8177FD"/>
     <w:multiLevelType w:val="hybridMultilevel"/>
     <w:tmpl w:val="F9000EBA"/>
@@ -4458,7 +8495,7 @@
       </w:rPr>
     </w:lvl>
   </w:abstractNum>
-  <w:abstractNum w:abstractNumId="32" w15:restartNumberingAfterBreak="0">
+  <w:abstractNum w:abstractNumId="35" w15:restartNumberingAfterBreak="0">
     <w:nsid w:val="6C53053C"/>
     <w:multiLevelType w:val="multilevel"/>
     <w:tmpl w:val="0409001D"/>
@@ -4544,7 +8581,7 @@
       </w:pPr>
     </w:lvl>
   </w:abstractNum>
-  <w:abstractNum w:abstractNumId="33" w15:restartNumberingAfterBreak="0">
+  <w:abstractNum w:abstractNumId="36" w15:restartNumberingAfterBreak="0">
     <w:nsid w:val="6DA63EBC"/>
     <w:multiLevelType w:val="multilevel"/>
     <w:tmpl w:val="D04EB668"/>
@@ -4693,7 +8730,7 @@
       </w:rPr>
     </w:lvl>
   </w:abstractNum>
-  <w:abstractNum w:abstractNumId="34" w15:restartNumberingAfterBreak="0">
+  <w:abstractNum w:abstractNumId="37" w15:restartNumberingAfterBreak="0">
     <w:nsid w:val="72836CD4"/>
     <w:multiLevelType w:val="hybridMultilevel"/>
     <w:tmpl w:val="7F6AAAEC"/>
@@ -4806,7 +8843,120 @@
       </w:rPr>
     </w:lvl>
   </w:abstractNum>
-  <w:abstractNum w:abstractNumId="35" w15:restartNumberingAfterBreak="0">
+  <w:abstractNum w:abstractNumId="38" w15:restartNumberingAfterBreak="0">
+    <w:nsid w:val="72A87A70"/>
+    <w:multiLevelType w:val="hybridMultilevel"/>
+    <w:tmpl w:val="C60C4410"/>
+    <w:lvl w:ilvl="0" w:tplc="04090001">
+      <w:start w:val="1"/>
+      <w:numFmt w:val="bullet"/>
+      <w:lvlText w:val=""/>
+      <w:lvlJc w:val="left"/>
+      <w:pPr>
+        <w:ind w:left="720" w:hanging="360"/>
+      </w:pPr>
+      <w:rPr>
+        <w:rFonts w:ascii="Symbol" w:hAnsi="Symbol" w:hint="default"/>
+      </w:rPr>
+    </w:lvl>
+    <w:lvl w:ilvl="1" w:tplc="04090003" w:tentative="1">
+      <w:start w:val="1"/>
+      <w:numFmt w:val="bullet"/>
+      <w:lvlText w:val="o"/>
+      <w:lvlJc w:val="left"/>
+      <w:pPr>
+        <w:ind w:left="1440" w:hanging="360"/>
+      </w:pPr>
+      <w:rPr>
+        <w:rFonts w:ascii="Courier New" w:hAnsi="Courier New" w:cs="Courier New" w:hint="default"/>
+      </w:rPr>
+    </w:lvl>
+    <w:lvl w:ilvl="2" w:tplc="04090005" w:tentative="1">
+      <w:start w:val="1"/>
+      <w:numFmt w:val="bullet"/>
+      <w:lvlText w:val=""/>
+      <w:lvlJc w:val="left"/>
+      <w:pPr>
+        <w:ind w:left="2160" w:hanging="360"/>
+      </w:pPr>
+      <w:rPr>
+        <w:rFonts w:ascii="Wingdings" w:hAnsi="Wingdings" w:hint="default"/>
+      </w:rPr>
+    </w:lvl>
+    <w:lvl w:ilvl="3" w:tplc="04090001" w:tentative="1">
+      <w:start w:val="1"/>
+      <w:numFmt w:val="bullet"/>
+      <w:lvlText w:val=""/>
+      <w:lvlJc w:val="left"/>
+      <w:pPr>
+        <w:ind w:left="2880" w:hanging="360"/>
+      </w:pPr>
+      <w:rPr>
+        <w:rFonts w:ascii="Symbol" w:hAnsi="Symbol" w:hint="default"/>
+      </w:rPr>
+    </w:lvl>
+    <w:lvl w:ilvl="4" w:tplc="04090003" w:tentative="1">
+      <w:start w:val="1"/>
+      <w:numFmt w:val="bullet"/>
+      <w:lvlText w:val="o"/>
+      <w:lvlJc w:val="left"/>
+      <w:pPr>
+        <w:ind w:left="3600" w:hanging="360"/>
+      </w:pPr>
+      <w:rPr>
+        <w:rFonts w:ascii="Courier New" w:hAnsi="Courier New" w:cs="Courier New" w:hint="default"/>
+      </w:rPr>
+    </w:lvl>
+    <w:lvl w:ilvl="5" w:tplc="04090005" w:tentative="1">
+      <w:start w:val="1"/>
+      <w:numFmt w:val="bullet"/>
+      <w:lvlText w:val=""/>
+      <w:lvlJc w:val="left"/>
+      <w:pPr>
+        <w:ind w:left="4320" w:hanging="360"/>
+      </w:pPr>
+      <w:rPr>
+        <w:rFonts w:ascii="Wingdings" w:hAnsi="Wingdings" w:hint="default"/>
+      </w:rPr>
+    </w:lvl>
+    <w:lvl w:ilvl="6" w:tplc="04090001" w:tentative="1">
+      <w:start w:val="1"/>
+      <w:numFmt w:val="bullet"/>
+      <w:lvlText w:val=""/>
+      <w:lvlJc w:val="left"/>
+      <w:pPr>
+        <w:ind w:left="5040" w:hanging="360"/>
+      </w:pPr>
+      <w:rPr>
+        <w:rFonts w:ascii="Symbol" w:hAnsi="Symbol" w:hint="default"/>
+      </w:rPr>
+    </w:lvl>
+    <w:lvl w:ilvl="7" w:tplc="04090003" w:tentative="1">
+      <w:start w:val="1"/>
+      <w:numFmt w:val="bullet"/>
+      <w:lvlText w:val="o"/>
+      <w:lvlJc w:val="left"/>
+      <w:pPr>
+        <w:ind w:left="5760" w:hanging="360"/>
+      </w:pPr>
+      <w:rPr>
+        <w:rFonts w:ascii="Courier New" w:hAnsi="Courier New" w:cs="Courier New" w:hint="default"/>
+      </w:rPr>
+    </w:lvl>
+    <w:lvl w:ilvl="8" w:tplc="04090005" w:tentative="1">
+      <w:start w:val="1"/>
+      <w:numFmt w:val="bullet"/>
+      <w:lvlText w:val=""/>
+      <w:lvlJc w:val="left"/>
+      <w:pPr>
+        <w:ind w:left="6480" w:hanging="360"/>
+      </w:pPr>
+      <w:rPr>
+        <w:rFonts w:ascii="Wingdings" w:hAnsi="Wingdings" w:hint="default"/>
+      </w:rPr>
+    </w:lvl>
+  </w:abstractNum>
+  <w:abstractNum w:abstractNumId="39" w15:restartNumberingAfterBreak="0">
     <w:nsid w:val="76100998"/>
     <w:multiLevelType w:val="hybridMultilevel"/>
     <w:tmpl w:val="710EC96A"/>
@@ -4919,7 +9069,7 @@
       </w:rPr>
     </w:lvl>
   </w:abstractNum>
-  <w:abstractNum w:abstractNumId="36" w15:restartNumberingAfterBreak="0">
+  <w:abstractNum w:abstractNumId="40" w15:restartNumberingAfterBreak="0">
     <w:nsid w:val="7A914E35"/>
     <w:multiLevelType w:val="multilevel"/>
     <w:tmpl w:val="0768836C"/>
@@ -5068,7 +9218,7 @@
       </w:rPr>
     </w:lvl>
   </w:abstractNum>
-  <w:abstractNum w:abstractNumId="37" w15:restartNumberingAfterBreak="0">
+  <w:abstractNum w:abstractNumId="41" w15:restartNumberingAfterBreak="0">
     <w:nsid w:val="7BC50F5C"/>
     <w:multiLevelType w:val="hybridMultilevel"/>
     <w:tmpl w:val="D9B23344"/>
@@ -5181,7 +9331,7 @@
       </w:rPr>
     </w:lvl>
   </w:abstractNum>
-  <w:abstractNum w:abstractNumId="38" w15:restartNumberingAfterBreak="0">
+  <w:abstractNum w:abstractNumId="42" w15:restartNumberingAfterBreak="0">
     <w:nsid w:val="7BD037B6"/>
     <w:multiLevelType w:val="multilevel"/>
     <w:tmpl w:val="DCDECE4C"/>
@@ -5294,7 +9444,7 @@
       </w:pPr>
     </w:lvl>
   </w:abstractNum>
-  <w:abstractNum w:abstractNumId="39" w15:restartNumberingAfterBreak="0">
+  <w:abstractNum w:abstractNumId="43" w15:restartNumberingAfterBreak="0">
     <w:nsid w:val="7E374A98"/>
     <w:multiLevelType w:val="hybridMultilevel"/>
     <w:tmpl w:val="DB0C0ADE"/>
@@ -5407,7 +9557,7 @@
       </w:rPr>
     </w:lvl>
   </w:abstractNum>
-  <w:abstractNum w:abstractNumId="40" w15:restartNumberingAfterBreak="0">
+  <w:abstractNum w:abstractNumId="44" w15:restartNumberingAfterBreak="0">
     <w:nsid w:val="7E584949"/>
     <w:multiLevelType w:val="hybridMultilevel"/>
     <w:tmpl w:val="50EE2470"/>
@@ -5520,7 +9670,7 @@
       </w:rPr>
     </w:lvl>
   </w:abstractNum>
-  <w:abstractNum w:abstractNumId="41" w15:restartNumberingAfterBreak="0">
+  <w:abstractNum w:abstractNumId="45" w15:restartNumberingAfterBreak="0">
     <w:nsid w:val="7FA77BD4"/>
     <w:multiLevelType w:val="multilevel"/>
     <w:tmpl w:val="9A38F7CE"/>
@@ -5637,7 +9787,7 @@
       </w:pPr>
     </w:lvl>
   </w:abstractNum>
-  <w:abstractNum w:abstractNumId="42" w15:restartNumberingAfterBreak="0">
+  <w:abstractNum w:abstractNumId="46" w15:restartNumberingAfterBreak="0">
     <w:nsid w:val="7FA9510B"/>
     <w:multiLevelType w:val="hybridMultilevel"/>
     <w:tmpl w:val="A1D84314"/>
@@ -5754,40 +9904,40 @@
     <w:abstractNumId w:val="4"/>
   </w:num>
   <w:num w:numId="2" w16cid:durableId="2085495234">
-    <w:abstractNumId w:val="21"/>
+    <w:abstractNumId w:val="24"/>
   </w:num>
   <w:num w:numId="3" w16cid:durableId="199098527">
     <w:abstractNumId w:val="9"/>
   </w:num>
   <w:num w:numId="4" w16cid:durableId="860972517">
-    <w:abstractNumId w:val="41"/>
+    <w:abstractNumId w:val="45"/>
   </w:num>
   <w:num w:numId="5" w16cid:durableId="1245382851">
+    <w:abstractNumId w:val="30"/>
+  </w:num>
+  <w:num w:numId="6" w16cid:durableId="1758675041">
+    <w:abstractNumId w:val="26"/>
+  </w:num>
+  <w:num w:numId="7" w16cid:durableId="56247709">
+    <w:abstractNumId w:val="33"/>
+  </w:num>
+  <w:num w:numId="8" w16cid:durableId="1165975295">
+    <w:abstractNumId w:val="28"/>
+  </w:num>
+  <w:num w:numId="9" w16cid:durableId="677737302">
+    <w:abstractNumId w:val="40"/>
+  </w:num>
+  <w:num w:numId="10" w16cid:durableId="872351428">
+    <w:abstractNumId w:val="36"/>
+  </w:num>
+  <w:num w:numId="11" w16cid:durableId="282033268">
     <w:abstractNumId w:val="27"/>
   </w:num>
-  <w:num w:numId="6" w16cid:durableId="1758675041">
-    <w:abstractNumId w:val="23"/>
-  </w:num>
-  <w:num w:numId="7" w16cid:durableId="56247709">
-    <w:abstractNumId w:val="30"/>
-  </w:num>
-  <w:num w:numId="8" w16cid:durableId="1165975295">
-    <w:abstractNumId w:val="25"/>
-  </w:num>
-  <w:num w:numId="9" w16cid:durableId="677737302">
-    <w:abstractNumId w:val="36"/>
-  </w:num>
-  <w:num w:numId="10" w16cid:durableId="872351428">
-    <w:abstractNumId w:val="33"/>
-  </w:num>
-  <w:num w:numId="11" w16cid:durableId="282033268">
-    <w:abstractNumId w:val="24"/>
-  </w:num>
   <w:num w:numId="12" w16cid:durableId="1900898234">
-    <w:abstractNumId w:val="14"/>
+    <w:abstractNumId w:val="16"/>
   </w:num>
   <w:num w:numId="13" w16cid:durableId="1921285434">
-    <w:abstractNumId w:val="38"/>
+    <w:abstractNumId w:val="42"/>
   </w:num>
   <w:num w:numId="14" w16cid:durableId="54474949">
     <w:abstractNumId w:val="0"/>
@@ -5796,43 +9946,43 @@
     <w:abstractNumId w:val="5"/>
   </w:num>
   <w:num w:numId="16" w16cid:durableId="2028553356">
-    <w:abstractNumId w:val="39"/>
+    <w:abstractNumId w:val="43"/>
   </w:num>
   <w:num w:numId="17" w16cid:durableId="591014610">
     <w:abstractNumId w:val="1"/>
   </w:num>
   <w:num w:numId="18" w16cid:durableId="406151587">
-    <w:abstractNumId w:val="37"/>
+    <w:abstractNumId w:val="41"/>
   </w:num>
   <w:num w:numId="19" w16cid:durableId="1296522490">
-    <w:abstractNumId w:val="17"/>
+    <w:abstractNumId w:val="19"/>
   </w:num>
   <w:num w:numId="20" w16cid:durableId="1996520160">
-    <w:abstractNumId w:val="20"/>
+    <w:abstractNumId w:val="22"/>
   </w:num>
   <w:num w:numId="21" w16cid:durableId="791485427">
-    <w:abstractNumId w:val="32"/>
+    <w:abstractNumId w:val="35"/>
   </w:num>
   <w:num w:numId="22" w16cid:durableId="1497460403">
     <w:abstractNumId w:val="10"/>
   </w:num>
   <w:num w:numId="23" w16cid:durableId="1127817319">
-    <w:abstractNumId w:val="16"/>
+    <w:abstractNumId w:val="18"/>
   </w:num>
   <w:num w:numId="24" w16cid:durableId="724178196">
-    <w:abstractNumId w:val="29"/>
+    <w:abstractNumId w:val="32"/>
   </w:num>
   <w:num w:numId="25" w16cid:durableId="182717555">
-    <w:abstractNumId w:val="19"/>
+    <w:abstractNumId w:val="21"/>
   </w:num>
   <w:num w:numId="26" w16cid:durableId="478159783">
-    <w:abstractNumId w:val="31"/>
+    <w:abstractNumId w:val="34"/>
   </w:num>
   <w:num w:numId="27" w16cid:durableId="174998487">
-    <w:abstractNumId w:val="22"/>
+    <w:abstractNumId w:val="25"/>
   </w:num>
   <w:num w:numId="28" w16cid:durableId="411393664">
-    <w:abstractNumId w:val="13"/>
+    <w:abstractNumId w:val="14"/>
   </w:num>
   <w:num w:numId="29" w16cid:durableId="2024433274">
     <w:abstractNumId w:val="11"/>
@@ -5841,43 +9991,55 @@
     <w:abstractNumId w:val="2"/>
   </w:num>
   <w:num w:numId="31" w16cid:durableId="1925064846">
-    <w:abstractNumId w:val="18"/>
+    <w:abstractNumId w:val="20"/>
   </w:num>
   <w:num w:numId="32" w16cid:durableId="888806455">
     <w:abstractNumId w:val="7"/>
   </w:num>
   <w:num w:numId="33" w16cid:durableId="181283547">
-    <w:abstractNumId w:val="26"/>
+    <w:abstractNumId w:val="29"/>
   </w:num>
   <w:num w:numId="34" w16cid:durableId="509180366">
     <w:abstractNumId w:val="8"/>
   </w:num>
   <w:num w:numId="35" w16cid:durableId="1110902260">
-    <w:abstractNumId w:val="12"/>
+    <w:abstractNumId w:val="13"/>
   </w:num>
   <w:num w:numId="36" w16cid:durableId="1257592171">
-    <w:abstractNumId w:val="15"/>
+    <w:abstractNumId w:val="17"/>
   </w:num>
   <w:num w:numId="37" w16cid:durableId="3479956">
-    <w:abstractNumId w:val="42"/>
+    <w:abstractNumId w:val="46"/>
   </w:num>
   <w:num w:numId="38" w16cid:durableId="1719276697">
-    <w:abstractNumId w:val="28"/>
+    <w:abstractNumId w:val="31"/>
   </w:num>
   <w:num w:numId="39" w16cid:durableId="721445009">
-    <w:abstractNumId w:val="34"/>
+    <w:abstractNumId w:val="37"/>
   </w:num>
   <w:num w:numId="40" w16cid:durableId="1375891146">
     <w:abstractNumId w:val="3"/>
   </w:num>
   <w:num w:numId="41" w16cid:durableId="566648891">
-    <w:abstractNumId w:val="35"/>
+    <w:abstractNumId w:val="39"/>
   </w:num>
   <w:num w:numId="42" w16cid:durableId="1294604932">
-    <w:abstractNumId w:val="40"/>
+    <w:abstractNumId w:val="44"/>
   </w:num>
   <w:num w:numId="43" w16cid:durableId="405342975">
     <w:abstractNumId w:val="6"/>
+  </w:num>
+  <w:num w:numId="44" w16cid:durableId="1236084929">
+    <w:abstractNumId w:val="23"/>
+  </w:num>
+  <w:num w:numId="45" w16cid:durableId="2098095808">
+    <w:abstractNumId w:val="12"/>
+  </w:num>
+  <w:num w:numId="46" w16cid:durableId="820463012">
+    <w:abstractNumId w:val="38"/>
+  </w:num>
+  <w:num w:numId="47" w16cid:durableId="28191834">
+    <w:abstractNumId w:val="15"/>
   </w:num>
   <w:numIdMacAtCleanup w:val="7"/>
 </w:numbering>
@@ -6485,6 +10647,7 @@
   <w:style w:type="character" w:default="1" w:styleId="DefaultParagraphFont">
     <w:name w:val="Default Paragraph Font"/>
     <w:uiPriority w:val="1"/>
+    <w:semiHidden/>
     <w:unhideWhenUsed/>
   </w:style>
   <w:style w:type="table" w:default="1" w:styleId="TableNormal">
@@ -6831,6 +10994,25 @@
       <w:u w:val="single"/>
     </w:rPr>
   </w:style>
+  <w:style w:type="table" w:styleId="TableGrid">
+    <w:name w:val="Table Grid"/>
+    <w:basedOn w:val="TableNormal"/>
+    <w:uiPriority w:val="39"/>
+    <w:rsid w:val="007B3573"/>
+    <w:pPr>
+      <w:spacing w:after="0" w:line="240" w:lineRule="auto"/>
+    </w:pPr>
+    <w:tblPr>
+      <w:tblBorders>
+        <w:top w:val="single" w:sz="4" w:space="0" w:color="auto"/>
+        <w:left w:val="single" w:sz="4" w:space="0" w:color="auto"/>
+        <w:bottom w:val="single" w:sz="4" w:space="0" w:color="auto"/>
+        <w:right w:val="single" w:sz="4" w:space="0" w:color="auto"/>
+        <w:insideH w:val="single" w:sz="4" w:space="0" w:color="auto"/>
+        <w:insideV w:val="single" w:sz="4" w:space="0" w:color="auto"/>
+      </w:tblBorders>
+    </w:tblPr>
+  </w:style>
 </w:styles>
 </file>
 

</xml_diff>